<commit_message>
updated report & added abstract
</commit_message>
<xml_diff>
--- a/TrustVerify_Proplox_PBL_Synopsis_Report.docx
+++ b/TrustVerify_Proplox_PBL_Synopsis_Report.docx
@@ -4,8 +4,7 @@
   <w:body>
     <w:p>
       <w:pPr>
-        <w:spacing w:after="200"/>
-        <w:jc w:val="center"/>
+        <w:spacing w:after="200" w:line="276" w:lineRule="auto"/>
         <w:rPr>
           <w:rFonts w:cs="Times New Roman"/>
           <w:sz w:val="28"/>
@@ -24,7 +23,7 @@
     </w:p>
     <w:p>
       <w:pPr>
-        <w:spacing w:after="200"/>
+        <w:spacing w:after="200" w:line="276" w:lineRule="auto"/>
         <w:jc w:val="center"/>
         <w:rPr>
           <w:rFonts w:cs="Times New Roman"/>
@@ -44,6 +43,7 @@
     </w:p>
     <w:p>
       <w:pPr>
+        <w:spacing w:line="276" w:lineRule="auto"/>
         <w:ind w:firstLine="259"/>
         <w:jc w:val="both"/>
         <w:rPr>
@@ -63,6 +63,7 @@
     </w:p>
     <w:p>
       <w:pPr>
+        <w:spacing w:line="276" w:lineRule="auto"/>
         <w:ind w:firstLine="259"/>
         <w:jc w:val="both"/>
         <w:rPr>
@@ -82,6 +83,7 @@
     </w:p>
     <w:p>
       <w:pPr>
+        <w:spacing w:line="276" w:lineRule="auto"/>
         <w:ind w:firstLine="259"/>
         <w:jc w:val="both"/>
         <w:rPr>
@@ -101,6 +103,7 @@
     </w:p>
     <w:p>
       <w:pPr>
+        <w:spacing w:line="276" w:lineRule="auto"/>
         <w:ind w:firstLine="259"/>
         <w:jc w:val="both"/>
         <w:rPr>
@@ -112,7 +115,7 @@
     </w:p>
     <w:p>
       <w:pPr>
-        <w:spacing w:before="100"/>
+        <w:spacing w:before="100" w:line="276" w:lineRule="auto"/>
         <w:rPr>
           <w:rFonts w:cs="Times New Roman"/>
           <w:sz w:val="24"/>
@@ -131,6 +134,7 @@
     </w:p>
     <w:p>
       <w:pPr>
+        <w:spacing w:line="276" w:lineRule="auto"/>
         <w:ind w:firstLine="259"/>
         <w:jc w:val="both"/>
         <w:rPr>
@@ -150,6 +154,7 @@
     </w:p>
     <w:p>
       <w:pPr>
+        <w:spacing w:line="276" w:lineRule="auto"/>
         <w:ind w:firstLine="259"/>
         <w:jc w:val="both"/>
         <w:rPr>
@@ -161,7 +166,79 @@
     </w:p>
     <w:p>
       <w:pPr>
-        <w:spacing w:before="100"/>
+        <w:spacing w:line="276" w:lineRule="auto"/>
+        <w:ind w:firstLine="259"/>
+        <w:jc w:val="both"/>
+        <w:rPr>
+          <w:rFonts w:cs="Times New Roman"/>
+          <w:sz w:val="24"/>
+          <w:szCs w:val="24"/>
+        </w:rPr>
+      </w:pPr>
+    </w:p>
+    <w:p>
+      <w:pPr>
+        <w:spacing w:line="276" w:lineRule="auto"/>
+        <w:ind w:firstLine="259"/>
+        <w:jc w:val="both"/>
+        <w:rPr>
+          <w:rFonts w:cs="Times New Roman"/>
+          <w:sz w:val="24"/>
+          <w:szCs w:val="24"/>
+        </w:rPr>
+      </w:pPr>
+    </w:p>
+    <w:p>
+      <w:pPr>
+        <w:spacing w:line="276" w:lineRule="auto"/>
+        <w:ind w:firstLine="259"/>
+        <w:jc w:val="both"/>
+        <w:rPr>
+          <w:rFonts w:cs="Times New Roman"/>
+          <w:sz w:val="24"/>
+          <w:szCs w:val="24"/>
+        </w:rPr>
+      </w:pPr>
+    </w:p>
+    <w:p>
+      <w:pPr>
+        <w:spacing w:line="276" w:lineRule="auto"/>
+        <w:ind w:firstLine="259"/>
+        <w:jc w:val="both"/>
+        <w:rPr>
+          <w:rFonts w:cs="Times New Roman"/>
+          <w:sz w:val="24"/>
+          <w:szCs w:val="24"/>
+        </w:rPr>
+      </w:pPr>
+    </w:p>
+    <w:p>
+      <w:pPr>
+        <w:spacing w:line="276" w:lineRule="auto"/>
+        <w:ind w:firstLine="259"/>
+        <w:jc w:val="both"/>
+        <w:rPr>
+          <w:rFonts w:cs="Times New Roman"/>
+          <w:sz w:val="24"/>
+          <w:szCs w:val="24"/>
+        </w:rPr>
+      </w:pPr>
+    </w:p>
+    <w:p>
+      <w:pPr>
+        <w:spacing w:line="276" w:lineRule="auto"/>
+        <w:ind w:firstLine="259"/>
+        <w:jc w:val="both"/>
+        <w:rPr>
+          <w:rFonts w:cs="Times New Roman"/>
+          <w:sz w:val="24"/>
+          <w:szCs w:val="24"/>
+        </w:rPr>
+      </w:pPr>
+    </w:p>
+    <w:p>
+      <w:pPr>
+        <w:spacing w:before="100" w:line="276" w:lineRule="auto"/>
         <w:rPr>
           <w:rFonts w:cs="Times New Roman"/>
           <w:sz w:val="24"/>
@@ -175,54 +252,93 @@
           <w:sz w:val="24"/>
           <w:szCs w:val="24"/>
         </w:rPr>
+        <w:lastRenderedPageBreak/>
         <w:t>1.2 Objective</w:t>
       </w:r>
     </w:p>
     <w:p>
       <w:pPr>
-        <w:pStyle w:val="ListBullet"/>
-        <w:spacing w:after="60"/>
-        <w:ind w:left="403" w:hanging="173"/>
-        <w:rPr>
-          <w:rFonts w:cs="Times New Roman"/>
-          <w:sz w:val="24"/>
-          <w:szCs w:val="24"/>
+        <w:pStyle w:val="ListParagraph"/>
+        <w:numPr>
+          <w:ilvl w:val="0"/>
+          <w:numId w:val="10"/>
+        </w:numPr>
+        <w:spacing w:line="276" w:lineRule="auto"/>
+        <w:jc w:val="both"/>
+        <w:rPr>
+          <w:rFonts w:cs="Times New Roman"/>
+          <w:sz w:val="24"/>
+          <w:szCs w:val="24"/>
+          <w:lang w:val="en-IN"/>
         </w:rPr>
       </w:pPr>
       <w:r>
         <w:rPr>
           <w:rFonts w:cs="Times New Roman"/>
-          <w:sz w:val="24"/>
-          <w:szCs w:val="24"/>
-        </w:rPr>
-        <w:t>To design an AI-powered property document verification system.</w:t>
+          <w:b/>
+          <w:bCs/>
+          <w:sz w:val="24"/>
+          <w:szCs w:val="24"/>
+          <w:lang w:val="en-IN"/>
+        </w:rPr>
+        <w:t>To design</w:t>
+      </w:r>
+      <w:r>
+        <w:rPr>
+          <w:rFonts w:cs="Times New Roman"/>
+          <w:sz w:val="24"/>
+          <w:szCs w:val="24"/>
+          <w:lang w:val="en-IN"/>
+        </w:rPr>
+        <w:t xml:space="preserve"> an AI-powered property document verification system for analysing and validating property-related documents. </w:t>
       </w:r>
     </w:p>
     <w:p>
       <w:pPr>
-        <w:pStyle w:val="ListBullet"/>
-        <w:spacing w:after="60"/>
-        <w:ind w:left="403" w:hanging="173"/>
-        <w:rPr>
-          <w:rFonts w:cs="Times New Roman"/>
-          <w:sz w:val="24"/>
-          <w:szCs w:val="24"/>
+        <w:pStyle w:val="ListParagraph"/>
+        <w:numPr>
+          <w:ilvl w:val="0"/>
+          <w:numId w:val="10"/>
+        </w:numPr>
+        <w:spacing w:line="276" w:lineRule="auto"/>
+        <w:jc w:val="both"/>
+        <w:rPr>
+          <w:rFonts w:cs="Times New Roman"/>
+          <w:sz w:val="24"/>
+          <w:szCs w:val="24"/>
+          <w:lang w:val="en-IN"/>
         </w:rPr>
       </w:pPr>
       <w:r>
         <w:rPr>
           <w:rFonts w:cs="Times New Roman"/>
-          <w:sz w:val="24"/>
-          <w:szCs w:val="24"/>
-        </w:rPr>
-        <w:t>To extract relevant information from heterogeneous property documents.</w:t>
+          <w:b/>
+          <w:bCs/>
+          <w:sz w:val="24"/>
+          <w:szCs w:val="24"/>
+          <w:lang w:val="en-IN"/>
+        </w:rPr>
+        <w:t>To develop</w:t>
+      </w:r>
+      <w:r>
+        <w:rPr>
+          <w:rFonts w:cs="Times New Roman"/>
+          <w:sz w:val="24"/>
+          <w:szCs w:val="24"/>
+          <w:lang w:val="en-IN"/>
+        </w:rPr>
+        <w:t xml:space="preserve"> an intelligent system that extracts relevant information and cross-verifies ownership, property extent, encumbrances, and other key details across multiple documents. </w:t>
       </w:r>
     </w:p>
     <w:p>
       <w:pPr>
-        <w:pStyle w:val="ListBullet"/>
-        <w:spacing w:after="60"/>
-        <w:ind w:left="403" w:hanging="173"/>
+        <w:pStyle w:val="ListParagraph"/>
+        <w:numPr>
+          <w:ilvl w:val="0"/>
+          <w:numId w:val="10"/>
+        </w:numPr>
+        <w:spacing w:line="276" w:lineRule="auto"/>
+        <w:jc w:val="both"/>
         <w:rPr>
           <w:rFonts w:cs="Times New Roman"/>
           <w:sz w:val="24"/>
@@ -232,80 +348,23 @@
       <w:r>
         <w:rPr>
           <w:rFonts w:cs="Times New Roman"/>
-          <w:sz w:val="24"/>
-          <w:szCs w:val="24"/>
-        </w:rPr>
-        <w:t>To cross-verify ownership, property extent, encumbrances, and related details across documents.</w:t>
+          <w:b/>
+          <w:bCs/>
+          <w:sz w:val="24"/>
+          <w:szCs w:val="24"/>
+          <w:lang w:val="en-IN"/>
+        </w:rPr>
+        <w:t>To implement</w:t>
       </w:r>
-    </w:p>
-    <w:p>
-      <w:pPr>
-        <w:pStyle w:val="ListBullet"/>
-        <w:spacing w:after="60"/>
-        <w:ind w:left="403" w:hanging="173"/>
-        <w:rPr>
-          <w:rFonts w:cs="Times New Roman"/>
-          <w:sz w:val="24"/>
-          <w:szCs w:val="24"/>
-        </w:rPr>
-      </w:pPr>
       <w:r>
         <w:rPr>
           <w:rFonts w:cs="Times New Roman"/>
           <w:sz w:val="24"/>
           <w:szCs w:val="24"/>
-        </w:rPr>
-        <w:t>To identify missing information, mismatches, and potential risk indicators with severity levels.</w:t>
+          <w:lang w:val="en-IN"/>
+        </w:rPr>
+        <w:t xml:space="preserve"> a risk detection and reporting mechanism that identifies missing information, mismatches, and potential risk indicators with severity levels and generates a structured verification report.</w:t>
       </w:r>
-    </w:p>
-    <w:p>
-      <w:pPr>
-        <w:pStyle w:val="ListBullet"/>
-        <w:spacing w:after="60"/>
-        <w:ind w:left="403" w:hanging="173"/>
-        <w:rPr>
-          <w:rFonts w:cs="Times New Roman"/>
-          <w:sz w:val="24"/>
-          <w:szCs w:val="24"/>
-        </w:rPr>
-      </w:pPr>
-      <w:r>
-        <w:rPr>
-          <w:rFonts w:cs="Times New Roman"/>
-          <w:sz w:val="24"/>
-          <w:szCs w:val="24"/>
-        </w:rPr>
-        <w:t>To generate a structured verification report that can support buyers, lawyers, builders, and financial institutions.</w:t>
-      </w:r>
-    </w:p>
-    <w:p>
-      <w:pPr>
-        <w:pStyle w:val="ListBullet"/>
-        <w:spacing w:after="60"/>
-        <w:ind w:left="403" w:hanging="173"/>
-        <w:rPr>
-          <w:rFonts w:cs="Times New Roman"/>
-          <w:sz w:val="24"/>
-          <w:szCs w:val="24"/>
-        </w:rPr>
-      </w:pPr>
-      <w:r>
-        <w:rPr>
-          <w:rFonts w:cs="Times New Roman"/>
-          <w:sz w:val="24"/>
-          <w:szCs w:val="24"/>
-        </w:rPr>
-        <w:t>To protect property and user information through secure authentication and role-based access.</w:t>
-      </w:r>
-    </w:p>
-    <w:p>
-      <w:pPr>
-        <w:rPr>
-          <w:rFonts w:cs="Times New Roman"/>
-          <w:sz w:val="24"/>
-          <w:szCs w:val="24"/>
-        </w:rPr>
-      </w:pPr>
       <w:r>
         <w:rPr>
           <w:rFonts w:cs="Times New Roman"/>
@@ -317,7 +376,7 @@
     </w:p>
     <w:p>
       <w:pPr>
-        <w:spacing w:before="100"/>
+        <w:spacing w:before="100" w:line="276" w:lineRule="auto"/>
         <w:rPr>
           <w:rFonts w:cs="Times New Roman"/>
           <w:sz w:val="24"/>
@@ -337,6 +396,7 @@
     </w:p>
     <w:p>
       <w:pPr>
+        <w:spacing w:line="276" w:lineRule="auto"/>
         <w:ind w:firstLine="259"/>
         <w:jc w:val="both"/>
         <w:rPr>
@@ -356,6 +416,7 @@
     </w:p>
     <w:p>
       <w:pPr>
+        <w:spacing w:line="276" w:lineRule="auto"/>
         <w:ind w:firstLine="259"/>
         <w:jc w:val="both"/>
         <w:rPr>
@@ -375,6 +436,7 @@
     </w:p>
     <w:p>
       <w:pPr>
+        <w:spacing w:line="276" w:lineRule="auto"/>
         <w:ind w:firstLine="259"/>
         <w:jc w:val="both"/>
         <w:rPr>
@@ -394,6 +456,7 @@
     </w:p>
     <w:p>
       <w:pPr>
+        <w:spacing w:line="276" w:lineRule="auto"/>
         <w:ind w:firstLine="259"/>
         <w:jc w:val="both"/>
         <w:rPr>
@@ -405,7 +468,7 @@
     </w:p>
     <w:p>
       <w:pPr>
-        <w:spacing w:before="100"/>
+        <w:spacing w:before="100" w:line="276" w:lineRule="auto"/>
         <w:rPr>
           <w:rFonts w:cs="Times New Roman"/>
           <w:sz w:val="28"/>
@@ -425,8 +488,12 @@
     <w:p>
       <w:pPr>
         <w:pStyle w:val="ListBullet"/>
-        <w:spacing w:after="60"/>
-        <w:ind w:left="403" w:hanging="173"/>
+        <w:numPr>
+          <w:ilvl w:val="0"/>
+          <w:numId w:val="11"/>
+        </w:numPr>
+        <w:spacing w:after="60" w:line="276" w:lineRule="auto"/>
+        <w:ind w:left="720"/>
         <w:rPr>
           <w:rFonts w:cs="Times New Roman"/>
           <w:sz w:val="24"/>
@@ -445,8 +512,12 @@
     <w:p>
       <w:pPr>
         <w:pStyle w:val="ListBullet"/>
-        <w:spacing w:after="60"/>
-        <w:ind w:left="403" w:hanging="173"/>
+        <w:numPr>
+          <w:ilvl w:val="0"/>
+          <w:numId w:val="11"/>
+        </w:numPr>
+        <w:spacing w:after="60" w:line="276" w:lineRule="auto"/>
+        <w:ind w:left="720"/>
         <w:rPr>
           <w:rFonts w:cs="Times New Roman"/>
           <w:sz w:val="24"/>
@@ -465,8 +536,12 @@
     <w:p>
       <w:pPr>
         <w:pStyle w:val="ListBullet"/>
-        <w:spacing w:after="60"/>
-        <w:ind w:left="403" w:hanging="173"/>
+        <w:numPr>
+          <w:ilvl w:val="0"/>
+          <w:numId w:val="11"/>
+        </w:numPr>
+        <w:spacing w:after="60" w:line="276" w:lineRule="auto"/>
+        <w:ind w:left="720"/>
         <w:rPr>
           <w:rFonts w:cs="Times New Roman"/>
           <w:sz w:val="24"/>
@@ -485,8 +560,12 @@
     <w:p>
       <w:pPr>
         <w:pStyle w:val="ListBullet"/>
-        <w:spacing w:after="60"/>
-        <w:ind w:left="403" w:hanging="173"/>
+        <w:numPr>
+          <w:ilvl w:val="0"/>
+          <w:numId w:val="11"/>
+        </w:numPr>
+        <w:spacing w:after="60" w:line="276" w:lineRule="auto"/>
+        <w:ind w:left="720"/>
         <w:rPr>
           <w:rFonts w:cs="Times New Roman"/>
           <w:sz w:val="24"/>
@@ -505,8 +584,12 @@
     <w:p>
       <w:pPr>
         <w:pStyle w:val="ListBullet"/>
-        <w:spacing w:after="60"/>
-        <w:ind w:left="403" w:hanging="173"/>
+        <w:numPr>
+          <w:ilvl w:val="0"/>
+          <w:numId w:val="11"/>
+        </w:numPr>
+        <w:spacing w:after="60" w:line="276" w:lineRule="auto"/>
+        <w:ind w:left="720"/>
         <w:rPr>
           <w:rFonts w:cs="Times New Roman"/>
           <w:sz w:val="24"/>
@@ -525,8 +608,12 @@
     <w:p>
       <w:pPr>
         <w:pStyle w:val="ListBullet"/>
-        <w:spacing w:after="60"/>
-        <w:ind w:left="403" w:hanging="173"/>
+        <w:numPr>
+          <w:ilvl w:val="0"/>
+          <w:numId w:val="11"/>
+        </w:numPr>
+        <w:spacing w:after="60" w:line="276" w:lineRule="auto"/>
+        <w:ind w:left="720"/>
         <w:rPr>
           <w:rFonts w:cs="Times New Roman"/>
           <w:sz w:val="24"/>
@@ -545,8 +632,12 @@
     <w:p>
       <w:pPr>
         <w:pStyle w:val="ListBullet"/>
-        <w:spacing w:after="60"/>
-        <w:ind w:left="403" w:hanging="173"/>
+        <w:numPr>
+          <w:ilvl w:val="0"/>
+          <w:numId w:val="11"/>
+        </w:numPr>
+        <w:spacing w:after="60" w:line="276" w:lineRule="auto"/>
+        <w:ind w:left="720"/>
         <w:rPr>
           <w:rFonts w:cs="Times New Roman"/>
           <w:sz w:val="24"/>
@@ -564,6 +655,7 @@
     </w:p>
     <w:p>
       <w:pPr>
+        <w:spacing w:line="276" w:lineRule="auto"/>
         <w:rPr>
           <w:rFonts w:cs="Times New Roman"/>
           <w:sz w:val="24"/>
@@ -581,8 +673,7 @@
     </w:p>
     <w:p>
       <w:pPr>
-        <w:spacing w:after="200"/>
-        <w:jc w:val="center"/>
+        <w:spacing w:after="200" w:line="276" w:lineRule="auto"/>
         <w:rPr>
           <w:rFonts w:cs="Times New Roman"/>
           <w:sz w:val="28"/>
@@ -602,7 +693,7 @@
     </w:p>
     <w:p>
       <w:pPr>
-        <w:spacing w:after="200"/>
+        <w:spacing w:after="200" w:line="276" w:lineRule="auto"/>
         <w:jc w:val="center"/>
         <w:rPr>
           <w:rFonts w:cs="Times New Roman"/>
@@ -622,7 +713,7 @@
     </w:p>
     <w:p>
       <w:pPr>
-        <w:spacing w:before="100"/>
+        <w:spacing w:before="100" w:line="276" w:lineRule="auto"/>
         <w:rPr>
           <w:rFonts w:cs="Times New Roman"/>
           <w:sz w:val="24"/>
@@ -641,6 +732,7 @@
     </w:p>
     <w:p>
       <w:pPr>
+        <w:spacing w:line="276" w:lineRule="auto"/>
         <w:ind w:firstLine="259"/>
         <w:jc w:val="both"/>
         <w:rPr>
@@ -660,6 +752,7 @@
     </w:p>
     <w:p>
       <w:pPr>
+        <w:spacing w:line="276" w:lineRule="auto"/>
         <w:ind w:firstLine="259"/>
         <w:jc w:val="both"/>
         <w:rPr>
@@ -674,11 +767,12 @@
           <w:sz w:val="24"/>
           <w:szCs w:val="24"/>
         </w:rPr>
-        <w:t>This survey reviews information extraction from legal documents, including named-entity recognition, relationship extraction, and event detection. It highlights that legal documents are often lengthy, unstructured, and difficult to process manually. The findings support the use of NLP-based extraction to convert legal text into structured information, while also emphasizing the importance of accuracy because extracted information may influence important decisions.</w:t>
+        <w:t xml:space="preserve">This survey reviews information extraction from legal documents, including named-entity recognition, relationship extraction, and event detection. It highlights that legal documents are often lengthy, unstructured, and difficult to process manually. </w:t>
       </w:r>
     </w:p>
     <w:p>
       <w:pPr>
+        <w:spacing w:line="276" w:lineRule="auto"/>
         <w:ind w:firstLine="259"/>
         <w:jc w:val="both"/>
         <w:rPr>
@@ -690,7 +784,7 @@
     </w:p>
     <w:p>
       <w:pPr>
-        <w:spacing w:before="100"/>
+        <w:spacing w:before="100" w:line="276" w:lineRule="auto"/>
         <w:rPr>
           <w:rFonts w:cs="Times New Roman"/>
           <w:sz w:val="24"/>
@@ -709,6 +803,7 @@
     </w:p>
     <w:p>
       <w:pPr>
+        <w:spacing w:line="276" w:lineRule="auto"/>
         <w:ind w:firstLine="259"/>
         <w:jc w:val="both"/>
         <w:rPr>
@@ -728,6 +823,7 @@
     </w:p>
     <w:p>
       <w:pPr>
+        <w:spacing w:line="276" w:lineRule="auto"/>
         <w:ind w:firstLine="259"/>
         <w:jc w:val="both"/>
         <w:rPr>
@@ -747,6 +843,7 @@
     </w:p>
     <w:p>
       <w:pPr>
+        <w:spacing w:line="276" w:lineRule="auto"/>
         <w:rPr>
           <w:rFonts w:cs="Times New Roman"/>
           <w:sz w:val="24"/>
@@ -756,6 +853,7 @@
     </w:p>
     <w:p>
       <w:pPr>
+        <w:spacing w:line="276" w:lineRule="auto"/>
         <w:rPr>
           <w:rFonts w:cs="Times New Roman"/>
           <w:sz w:val="24"/>
@@ -774,6 +872,7 @@
     </w:p>
     <w:p>
       <w:pPr>
+        <w:spacing w:line="276" w:lineRule="auto"/>
         <w:ind w:firstLine="259"/>
         <w:jc w:val="both"/>
         <w:rPr>
@@ -793,6 +892,7 @@
     </w:p>
     <w:p>
       <w:pPr>
+        <w:spacing w:line="276" w:lineRule="auto"/>
         <w:ind w:firstLine="259"/>
         <w:jc w:val="both"/>
         <w:rPr>
@@ -812,6 +912,7 @@
     </w:p>
     <w:p>
       <w:pPr>
+        <w:spacing w:line="276" w:lineRule="auto"/>
         <w:ind w:firstLine="259"/>
         <w:jc w:val="both"/>
         <w:rPr>
@@ -823,7 +924,7 @@
     </w:p>
     <w:p>
       <w:pPr>
-        <w:spacing w:before="100"/>
+        <w:spacing w:before="100" w:line="276" w:lineRule="auto"/>
         <w:rPr>
           <w:rFonts w:cs="Times New Roman"/>
           <w:sz w:val="24"/>
@@ -842,6 +943,7 @@
     </w:p>
     <w:p>
       <w:pPr>
+        <w:spacing w:line="276" w:lineRule="auto"/>
         <w:ind w:firstLine="259"/>
         <w:jc w:val="both"/>
         <w:rPr>
@@ -867,6 +969,22 @@
         </w:rPr>
         <w:t>Not</w:t>
       </w:r>
+      <w:r>
+        <w:rPr>
+          <w:rFonts w:cs="Times New Roman"/>
+          <w:sz w:val="24"/>
+          <w:szCs w:val="24"/>
+        </w:rPr>
+        <w:t xml:space="preserve"> </w:t>
+      </w:r>
+      <w:r>
+        <w:rPr>
+          <w:rFonts w:cs="Times New Roman"/>
+          <w:sz w:val="24"/>
+          <w:szCs w:val="24"/>
+        </w:rPr>
+        <w:t>?</w:t>
+      </w:r>
       <w:proofErr w:type="gramEnd"/>
       <w:r>
         <w:rPr>
@@ -874,11 +992,12 @@
           <w:sz w:val="24"/>
           <w:szCs w:val="24"/>
         </w:rPr>
-        <w:t>? Rethinking Document Information Extraction in the MLLMs Era with Real-World Large-Scale Datasets</w:t>
+        <w:t xml:space="preserve"> Rethinking Document Information Extraction in the MLLMs Era with Real-World Large-Scale Datasets</w:t>
       </w:r>
     </w:p>
     <w:p>
       <w:pPr>
+        <w:spacing w:line="276" w:lineRule="auto"/>
         <w:ind w:firstLine="259"/>
         <w:jc w:val="both"/>
         <w:rPr>
@@ -893,30 +1012,12 @@
           <w:sz w:val="24"/>
           <w:szCs w:val="24"/>
         </w:rPr>
-        <w:t>This study evaluates multimodal large language models for document information extraction and examines OCR-based and image-based approaches. It highlights the potential of multimodal models for extracting structured information from documents while also identifying failure modes that require careful evaluation. This supports the use of document intelligence in TrustVerify while reinforcing the need for confidence-aware and human-reviewed verification.</w:t>
+        <w:t xml:space="preserve">This study evaluates multimodal large language models for document information extraction and examines OCR-based and image-based approaches. It highlights the potential of multimodal models for extracting structured information from documents while also identifying failure modes that require careful evaluation. </w:t>
       </w:r>
     </w:p>
     <w:p>
       <w:pPr>
-        <w:rPr>
-          <w:rFonts w:cs="Times New Roman"/>
-          <w:sz w:val="24"/>
-          <w:szCs w:val="24"/>
-        </w:rPr>
-      </w:pPr>
-      <w:r>
-        <w:rPr>
-          <w:rFonts w:cs="Times New Roman"/>
-          <w:sz w:val="24"/>
-          <w:szCs w:val="24"/>
-        </w:rPr>
-        <w:br w:type="page"/>
-      </w:r>
-    </w:p>
-    <w:p>
-      <w:pPr>
-        <w:spacing w:after="200"/>
-        <w:jc w:val="center"/>
+        <w:spacing w:after="200" w:line="276" w:lineRule="auto"/>
         <w:rPr>
           <w:rFonts w:cs="Times New Roman"/>
           <w:sz w:val="28"/>
@@ -936,27 +1037,27 @@
     </w:p>
     <w:p>
       <w:pPr>
-        <w:spacing w:after="200"/>
+        <w:spacing w:after="200" w:line="276" w:lineRule="auto"/>
         <w:jc w:val="center"/>
         <w:rPr>
           <w:rFonts w:cs="Times New Roman"/>
-          <w:sz w:val="28"/>
-          <w:szCs w:val="28"/>
+          <w:sz w:val="32"/>
+          <w:szCs w:val="32"/>
         </w:rPr>
       </w:pPr>
       <w:r>
         <w:rPr>
           <w:rFonts w:cs="Times New Roman"/>
           <w:b/>
-          <w:sz w:val="28"/>
-          <w:szCs w:val="28"/>
+          <w:sz w:val="32"/>
+          <w:szCs w:val="32"/>
         </w:rPr>
         <w:t>SYSTEM REQUIREMENTS</w:t>
       </w:r>
     </w:p>
     <w:p>
       <w:pPr>
-        <w:spacing w:before="100"/>
+        <w:spacing w:before="100" w:line="276" w:lineRule="auto"/>
         <w:rPr>
           <w:rFonts w:cs="Times New Roman"/>
           <w:sz w:val="24"/>
@@ -976,8 +1077,11 @@
     <w:p>
       <w:pPr>
         <w:pStyle w:val="ListBullet"/>
-        <w:spacing w:after="60"/>
-        <w:ind w:left="403" w:hanging="173"/>
+        <w:numPr>
+          <w:ilvl w:val="0"/>
+          <w:numId w:val="18"/>
+        </w:numPr>
+        <w:spacing w:after="60" w:line="276" w:lineRule="auto"/>
         <w:rPr>
           <w:rFonts w:cs="Times New Roman"/>
           <w:sz w:val="24"/>
@@ -996,8 +1100,11 @@
     <w:p>
       <w:pPr>
         <w:pStyle w:val="ListBullet"/>
-        <w:spacing w:after="60"/>
-        <w:ind w:left="403" w:hanging="173"/>
+        <w:numPr>
+          <w:ilvl w:val="0"/>
+          <w:numId w:val="18"/>
+        </w:numPr>
+        <w:spacing w:after="60" w:line="276" w:lineRule="auto"/>
         <w:rPr>
           <w:rFonts w:cs="Times New Roman"/>
           <w:sz w:val="24"/>
@@ -1016,8 +1123,11 @@
     <w:p>
       <w:pPr>
         <w:pStyle w:val="ListBullet"/>
-        <w:spacing w:after="60"/>
-        <w:ind w:left="403" w:hanging="173"/>
+        <w:numPr>
+          <w:ilvl w:val="0"/>
+          <w:numId w:val="18"/>
+        </w:numPr>
+        <w:spacing w:after="60" w:line="276" w:lineRule="auto"/>
         <w:rPr>
           <w:rFonts w:cs="Times New Roman"/>
           <w:sz w:val="24"/>
@@ -1036,8 +1146,11 @@
     <w:p>
       <w:pPr>
         <w:pStyle w:val="ListBullet"/>
-        <w:spacing w:after="60"/>
-        <w:ind w:left="403" w:hanging="173"/>
+        <w:numPr>
+          <w:ilvl w:val="0"/>
+          <w:numId w:val="18"/>
+        </w:numPr>
+        <w:spacing w:after="60" w:line="276" w:lineRule="auto"/>
         <w:rPr>
           <w:rFonts w:cs="Times New Roman"/>
           <w:sz w:val="24"/>
@@ -1060,8 +1173,8 @@
           <w:ilvl w:val="0"/>
           <w:numId w:val="0"/>
         </w:numPr>
-        <w:spacing w:after="60"/>
-        <w:ind w:left="403"/>
+        <w:spacing w:after="60" w:line="276" w:lineRule="auto"/>
+        <w:ind w:left="360" w:hanging="360"/>
         <w:rPr>
           <w:rFonts w:cs="Times New Roman"/>
           <w:sz w:val="24"/>
@@ -1071,7 +1184,7 @@
     </w:p>
     <w:p>
       <w:pPr>
-        <w:spacing w:before="100"/>
+        <w:spacing w:before="100" w:line="276" w:lineRule="auto"/>
         <w:rPr>
           <w:rFonts w:cs="Times New Roman"/>
           <w:sz w:val="24"/>
@@ -1091,8 +1204,11 @@
     <w:p>
       <w:pPr>
         <w:pStyle w:val="ListBullet"/>
-        <w:spacing w:after="60"/>
-        <w:ind w:left="403" w:hanging="173"/>
+        <w:numPr>
+          <w:ilvl w:val="0"/>
+          <w:numId w:val="18"/>
+        </w:numPr>
+        <w:spacing w:after="60" w:line="276" w:lineRule="auto"/>
         <w:rPr>
           <w:rFonts w:cs="Times New Roman"/>
           <w:sz w:val="24"/>
@@ -1111,8 +1227,11 @@
     <w:p>
       <w:pPr>
         <w:pStyle w:val="ListBullet"/>
-        <w:spacing w:after="60"/>
-        <w:ind w:left="403" w:hanging="173"/>
+        <w:numPr>
+          <w:ilvl w:val="0"/>
+          <w:numId w:val="18"/>
+        </w:numPr>
+        <w:spacing w:after="60" w:line="276" w:lineRule="auto"/>
         <w:rPr>
           <w:rFonts w:cs="Times New Roman"/>
           <w:sz w:val="24"/>
@@ -1131,8 +1250,11 @@
     <w:p>
       <w:pPr>
         <w:pStyle w:val="ListBullet"/>
-        <w:spacing w:after="60"/>
-        <w:ind w:left="403" w:hanging="173"/>
+        <w:numPr>
+          <w:ilvl w:val="0"/>
+          <w:numId w:val="18"/>
+        </w:numPr>
+        <w:spacing w:after="60" w:line="276" w:lineRule="auto"/>
         <w:rPr>
           <w:rFonts w:cs="Times New Roman"/>
           <w:sz w:val="24"/>
@@ -1151,8 +1273,11 @@
     <w:p>
       <w:pPr>
         <w:pStyle w:val="ListBullet"/>
-        <w:spacing w:after="60"/>
-        <w:ind w:left="403" w:hanging="173"/>
+        <w:numPr>
+          <w:ilvl w:val="0"/>
+          <w:numId w:val="18"/>
+        </w:numPr>
+        <w:spacing w:after="60" w:line="276" w:lineRule="auto"/>
         <w:rPr>
           <w:rFonts w:cs="Times New Roman"/>
           <w:sz w:val="24"/>
@@ -1171,8 +1296,11 @@
     <w:p>
       <w:pPr>
         <w:pStyle w:val="ListBullet"/>
-        <w:spacing w:after="60"/>
-        <w:ind w:left="403" w:hanging="173"/>
+        <w:numPr>
+          <w:ilvl w:val="0"/>
+          <w:numId w:val="18"/>
+        </w:numPr>
+        <w:spacing w:after="60" w:line="276" w:lineRule="auto"/>
         <w:rPr>
           <w:rFonts w:cs="Times New Roman"/>
           <w:sz w:val="24"/>
@@ -1191,8 +1319,11 @@
     <w:p>
       <w:pPr>
         <w:pStyle w:val="ListBullet"/>
-        <w:spacing w:after="60"/>
-        <w:ind w:left="403" w:hanging="173"/>
+        <w:numPr>
+          <w:ilvl w:val="0"/>
+          <w:numId w:val="18"/>
+        </w:numPr>
+        <w:spacing w:after="60" w:line="276" w:lineRule="auto"/>
         <w:rPr>
           <w:rFonts w:cs="Times New Roman"/>
           <w:sz w:val="24"/>
@@ -1211,8 +1342,11 @@
     <w:p>
       <w:pPr>
         <w:pStyle w:val="ListBullet"/>
-        <w:spacing w:after="60"/>
-        <w:ind w:left="403" w:hanging="173"/>
+        <w:numPr>
+          <w:ilvl w:val="0"/>
+          <w:numId w:val="18"/>
+        </w:numPr>
+        <w:spacing w:after="60" w:line="276" w:lineRule="auto"/>
         <w:rPr>
           <w:rFonts w:cs="Times New Roman"/>
           <w:sz w:val="24"/>
@@ -1231,8 +1365,11 @@
     <w:p>
       <w:pPr>
         <w:pStyle w:val="ListBullet"/>
-        <w:spacing w:after="60"/>
-        <w:ind w:left="403" w:hanging="173"/>
+        <w:numPr>
+          <w:ilvl w:val="0"/>
+          <w:numId w:val="18"/>
+        </w:numPr>
+        <w:spacing w:after="60" w:line="276" w:lineRule="auto"/>
         <w:rPr>
           <w:rFonts w:cs="Times New Roman"/>
           <w:sz w:val="24"/>
@@ -1251,8 +1388,11 @@
     <w:p>
       <w:pPr>
         <w:pStyle w:val="ListBullet"/>
-        <w:spacing w:after="60"/>
-        <w:ind w:left="403" w:hanging="173"/>
+        <w:numPr>
+          <w:ilvl w:val="0"/>
+          <w:numId w:val="18"/>
+        </w:numPr>
+        <w:spacing w:after="60" w:line="276" w:lineRule="auto"/>
         <w:rPr>
           <w:rFonts w:cs="Times New Roman"/>
           <w:sz w:val="24"/>
@@ -1270,6 +1410,7 @@
     </w:p>
     <w:p>
       <w:pPr>
+        <w:spacing w:line="276" w:lineRule="auto"/>
         <w:rPr>
           <w:rFonts w:cs="Times New Roman"/>
           <w:sz w:val="24"/>
@@ -1287,8 +1428,7 @@
     </w:p>
     <w:p>
       <w:pPr>
-        <w:spacing w:after="200"/>
-        <w:jc w:val="center"/>
+        <w:spacing w:after="200" w:line="276" w:lineRule="auto"/>
         <w:rPr>
           <w:rFonts w:cs="Times New Roman"/>
           <w:sz w:val="28"/>
@@ -1308,7 +1448,7 @@
     </w:p>
     <w:p>
       <w:pPr>
-        <w:spacing w:after="200"/>
+        <w:spacing w:after="200" w:line="276" w:lineRule="auto"/>
         <w:jc w:val="center"/>
         <w:rPr>
           <w:rFonts w:cs="Times New Roman"/>
@@ -1328,7 +1468,7 @@
     </w:p>
     <w:p>
       <w:pPr>
-        <w:spacing w:before="100"/>
+        <w:spacing w:before="100" w:line="276" w:lineRule="auto"/>
         <w:rPr>
           <w:rFonts w:cs="Times New Roman"/>
           <w:sz w:val="24"/>
@@ -1347,6 +1487,7 @@
     </w:p>
     <w:p>
       <w:pPr>
+        <w:spacing w:line="276" w:lineRule="auto"/>
         <w:ind w:firstLine="259"/>
         <w:jc w:val="both"/>
         <w:rPr>
@@ -1367,8 +1508,12 @@
     <w:p>
       <w:pPr>
         <w:pStyle w:val="ListBullet"/>
-        <w:spacing w:after="60"/>
-        <w:ind w:left="403" w:hanging="173"/>
+        <w:numPr>
+          <w:ilvl w:val="0"/>
+          <w:numId w:val="16"/>
+        </w:numPr>
+        <w:spacing w:after="60" w:line="276" w:lineRule="auto"/>
+        <w:jc w:val="both"/>
         <w:rPr>
           <w:rFonts w:cs="Times New Roman"/>
           <w:sz w:val="24"/>
@@ -1387,8 +1532,12 @@
     <w:p>
       <w:pPr>
         <w:pStyle w:val="ListBullet"/>
-        <w:spacing w:after="60"/>
-        <w:ind w:left="403" w:hanging="173"/>
+        <w:numPr>
+          <w:ilvl w:val="0"/>
+          <w:numId w:val="16"/>
+        </w:numPr>
+        <w:spacing w:after="60" w:line="276" w:lineRule="auto"/>
+        <w:jc w:val="both"/>
         <w:rPr>
           <w:rFonts w:cs="Times New Roman"/>
           <w:sz w:val="24"/>
@@ -1407,8 +1556,12 @@
     <w:p>
       <w:pPr>
         <w:pStyle w:val="ListBullet"/>
-        <w:spacing w:after="60"/>
-        <w:ind w:left="403" w:hanging="173"/>
+        <w:numPr>
+          <w:ilvl w:val="0"/>
+          <w:numId w:val="16"/>
+        </w:numPr>
+        <w:spacing w:after="60" w:line="276" w:lineRule="auto"/>
+        <w:jc w:val="both"/>
         <w:rPr>
           <w:rFonts w:cs="Times New Roman"/>
           <w:sz w:val="24"/>
@@ -1427,8 +1580,12 @@
     <w:p>
       <w:pPr>
         <w:pStyle w:val="ListBullet"/>
-        <w:spacing w:after="60"/>
-        <w:ind w:left="403" w:hanging="173"/>
+        <w:numPr>
+          <w:ilvl w:val="0"/>
+          <w:numId w:val="16"/>
+        </w:numPr>
+        <w:spacing w:after="60" w:line="276" w:lineRule="auto"/>
+        <w:jc w:val="both"/>
         <w:rPr>
           <w:rFonts w:cs="Times New Roman"/>
           <w:sz w:val="24"/>
@@ -1447,8 +1604,12 @@
     <w:p>
       <w:pPr>
         <w:pStyle w:val="ListBullet"/>
-        <w:spacing w:after="60"/>
-        <w:ind w:left="403" w:hanging="173"/>
+        <w:numPr>
+          <w:ilvl w:val="0"/>
+          <w:numId w:val="16"/>
+        </w:numPr>
+        <w:spacing w:after="60" w:line="276" w:lineRule="auto"/>
+        <w:jc w:val="both"/>
         <w:rPr>
           <w:rFonts w:cs="Times New Roman"/>
           <w:sz w:val="24"/>
@@ -1466,6 +1627,7 @@
     </w:p>
     <w:p>
       <w:pPr>
+        <w:spacing w:line="276" w:lineRule="auto"/>
         <w:jc w:val="center"/>
         <w:rPr>
           <w:rFonts w:cs="Times New Roman"/>
@@ -1481,9 +1643,9 @@
           <w:szCs w:val="24"/>
         </w:rPr>
         <w:drawing>
-          <wp:inline distT="0" distB="0" distL="0" distR="0" wp14:anchorId="4CA71668" wp14:editId="411363CE">
-            <wp:extent cx="5212080" cy="4365170"/>
-            <wp:effectExtent l="0" t="0" r="0" b="0"/>
+          <wp:inline distT="0" distB="0" distL="0" distR="0" wp14:anchorId="4CA71668" wp14:editId="0D878DFD">
+            <wp:extent cx="5210810" cy="3619315"/>
+            <wp:effectExtent l="0" t="0" r="0" b="635"/>
             <wp:docPr id="1" name="Picture 1"/>
             <wp:cNvGraphicFramePr>
               <a:graphicFrameLocks xmlns:a="http://schemas.openxmlformats.org/drawingml/2006/main" noChangeAspect="1"/>
@@ -1504,7 +1666,7 @@
                   <pic:spPr>
                     <a:xfrm>
                       <a:off x="0" y="0"/>
-                      <a:ext cx="5212080" cy="4365170"/>
+                      <a:ext cx="5224155" cy="3628584"/>
                     </a:xfrm>
                     <a:prstGeom prst="rect">
                       <a:avLst/>
@@ -1519,6 +1681,7 @@
     </w:p>
     <w:p>
       <w:pPr>
+        <w:spacing w:line="276" w:lineRule="auto"/>
         <w:jc w:val="center"/>
         <w:rPr>
           <w:rFonts w:cs="Times New Roman"/>
@@ -1538,6 +1701,7 @@
     </w:p>
     <w:p>
       <w:pPr>
+        <w:spacing w:line="276" w:lineRule="auto"/>
         <w:rPr>
           <w:rFonts w:cs="Times New Roman"/>
           <w:sz w:val="24"/>
@@ -1555,7 +1719,17 @@
     </w:p>
     <w:p>
       <w:pPr>
-        <w:spacing w:before="100"/>
+        <w:spacing w:line="276" w:lineRule="auto"/>
+        <w:rPr>
+          <w:rFonts w:cs="Times New Roman"/>
+          <w:sz w:val="24"/>
+          <w:szCs w:val="24"/>
+        </w:rPr>
+      </w:pPr>
+    </w:p>
+    <w:p>
+      <w:pPr>
+        <w:spacing w:before="100" w:line="276" w:lineRule="auto"/>
         <w:rPr>
           <w:rFonts w:cs="Times New Roman"/>
           <w:sz w:val="24"/>
@@ -1569,7 +1743,6 @@
           <w:sz w:val="24"/>
           <w:szCs w:val="24"/>
         </w:rPr>
-        <w:lastRenderedPageBreak/>
         <w:t>Workflow</w:t>
       </w:r>
     </w:p>
@@ -1580,7 +1753,7 @@
           <w:ilvl w:val="0"/>
           <w:numId w:val="0"/>
         </w:numPr>
-        <w:spacing w:after="60"/>
+        <w:spacing w:after="60" w:line="276" w:lineRule="auto"/>
         <w:ind w:left="230"/>
         <w:rPr>
           <w:rFonts w:cs="Times New Roman"/>
@@ -1604,7 +1777,7 @@
           <w:ilvl w:val="0"/>
           <w:numId w:val="0"/>
         </w:numPr>
-        <w:spacing w:after="60"/>
+        <w:spacing w:after="60" w:line="276" w:lineRule="auto"/>
         <w:ind w:left="230"/>
         <w:rPr>
           <w:rFonts w:cs="Times New Roman"/>
@@ -1628,7 +1801,7 @@
           <w:ilvl w:val="0"/>
           <w:numId w:val="0"/>
         </w:numPr>
-        <w:spacing w:after="60"/>
+        <w:spacing w:after="60" w:line="276" w:lineRule="auto"/>
         <w:ind w:left="230"/>
         <w:rPr>
           <w:rFonts w:cs="Times New Roman"/>
@@ -1652,7 +1825,7 @@
           <w:ilvl w:val="0"/>
           <w:numId w:val="0"/>
         </w:numPr>
-        <w:spacing w:after="60"/>
+        <w:spacing w:after="60" w:line="276" w:lineRule="auto"/>
         <w:ind w:left="230"/>
         <w:rPr>
           <w:rFonts w:cs="Times New Roman"/>
@@ -1676,7 +1849,7 @@
           <w:ilvl w:val="0"/>
           <w:numId w:val="0"/>
         </w:numPr>
-        <w:spacing w:after="60"/>
+        <w:spacing w:after="60" w:line="276" w:lineRule="auto"/>
         <w:ind w:left="230"/>
         <w:rPr>
           <w:rFonts w:cs="Times New Roman"/>
@@ -1700,7 +1873,7 @@
           <w:ilvl w:val="0"/>
           <w:numId w:val="0"/>
         </w:numPr>
-        <w:spacing w:after="60"/>
+        <w:spacing w:after="60" w:line="276" w:lineRule="auto"/>
         <w:ind w:left="230"/>
         <w:rPr>
           <w:rFonts w:cs="Times New Roman"/>
@@ -1724,7 +1897,7 @@
           <w:ilvl w:val="0"/>
           <w:numId w:val="0"/>
         </w:numPr>
-        <w:spacing w:after="60"/>
+        <w:spacing w:after="60" w:line="276" w:lineRule="auto"/>
         <w:ind w:left="230"/>
         <w:rPr>
           <w:rFonts w:cs="Times New Roman"/>
@@ -1748,7 +1921,7 @@
           <w:ilvl w:val="0"/>
           <w:numId w:val="0"/>
         </w:numPr>
-        <w:spacing w:after="60"/>
+        <w:spacing w:after="60" w:line="276" w:lineRule="auto"/>
         <w:ind w:left="230"/>
         <w:rPr>
           <w:rFonts w:cs="Times New Roman"/>
@@ -1772,7 +1945,7 @@
           <w:ilvl w:val="0"/>
           <w:numId w:val="0"/>
         </w:numPr>
-        <w:spacing w:after="60"/>
+        <w:spacing w:after="60" w:line="276" w:lineRule="auto"/>
         <w:ind w:left="230"/>
         <w:rPr>
           <w:rFonts w:cs="Times New Roman"/>
@@ -1783,7 +1956,7 @@
     </w:p>
     <w:p>
       <w:pPr>
-        <w:spacing w:before="100"/>
+        <w:spacing w:before="100" w:line="276" w:lineRule="auto"/>
         <w:rPr>
           <w:rFonts w:cs="Times New Roman"/>
           <w:sz w:val="24"/>
@@ -1803,8 +1976,11 @@
     <w:p>
       <w:pPr>
         <w:pStyle w:val="ListBullet"/>
-        <w:spacing w:after="60"/>
-        <w:ind w:left="403" w:hanging="173"/>
+        <w:numPr>
+          <w:ilvl w:val="0"/>
+          <w:numId w:val="15"/>
+        </w:numPr>
+        <w:spacing w:after="60" w:line="276" w:lineRule="auto"/>
         <w:rPr>
           <w:rFonts w:cs="Times New Roman"/>
           <w:sz w:val="24"/>
@@ -1823,8 +1999,11 @@
     <w:p>
       <w:pPr>
         <w:pStyle w:val="ListBullet"/>
-        <w:spacing w:after="60"/>
-        <w:ind w:left="403" w:hanging="173"/>
+        <w:numPr>
+          <w:ilvl w:val="0"/>
+          <w:numId w:val="15"/>
+        </w:numPr>
+        <w:spacing w:after="60" w:line="276" w:lineRule="auto"/>
         <w:rPr>
           <w:rFonts w:cs="Times New Roman"/>
           <w:sz w:val="24"/>
@@ -1843,8 +2022,11 @@
     <w:p>
       <w:pPr>
         <w:pStyle w:val="ListBullet"/>
-        <w:spacing w:after="60"/>
-        <w:ind w:left="403" w:hanging="173"/>
+        <w:numPr>
+          <w:ilvl w:val="0"/>
+          <w:numId w:val="15"/>
+        </w:numPr>
+        <w:spacing w:after="60" w:line="276" w:lineRule="auto"/>
         <w:rPr>
           <w:rFonts w:cs="Times New Roman"/>
           <w:sz w:val="24"/>
@@ -1867,7 +2049,7 @@
           <w:ilvl w:val="0"/>
           <w:numId w:val="0"/>
         </w:numPr>
-        <w:spacing w:after="60"/>
+        <w:spacing w:after="60" w:line="276" w:lineRule="auto"/>
         <w:ind w:left="403"/>
         <w:rPr>
           <w:rFonts w:cs="Times New Roman"/>
@@ -1878,7 +2060,7 @@
     </w:p>
     <w:p>
       <w:pPr>
-        <w:spacing w:before="100"/>
+        <w:spacing w:before="100" w:line="276" w:lineRule="auto"/>
         <w:rPr>
           <w:rFonts w:cs="Times New Roman"/>
           <w:sz w:val="24"/>
@@ -1898,8 +2080,11 @@
     <w:p>
       <w:pPr>
         <w:pStyle w:val="ListBullet"/>
-        <w:spacing w:after="60"/>
-        <w:ind w:left="403" w:hanging="173"/>
+        <w:numPr>
+          <w:ilvl w:val="0"/>
+          <w:numId w:val="15"/>
+        </w:numPr>
+        <w:spacing w:after="60" w:line="276" w:lineRule="auto"/>
         <w:rPr>
           <w:rFonts w:cs="Times New Roman"/>
           <w:sz w:val="24"/>
@@ -1918,8 +2103,11 @@
     <w:p>
       <w:pPr>
         <w:pStyle w:val="ListBullet"/>
-        <w:spacing w:after="60"/>
-        <w:ind w:left="403" w:hanging="173"/>
+        <w:numPr>
+          <w:ilvl w:val="0"/>
+          <w:numId w:val="15"/>
+        </w:numPr>
+        <w:spacing w:after="60" w:line="276" w:lineRule="auto"/>
         <w:rPr>
           <w:rFonts w:cs="Times New Roman"/>
           <w:sz w:val="24"/>
@@ -1938,8 +2126,11 @@
     <w:p>
       <w:pPr>
         <w:pStyle w:val="ListBullet"/>
-        <w:spacing w:after="60"/>
-        <w:ind w:left="403" w:hanging="173"/>
+        <w:numPr>
+          <w:ilvl w:val="0"/>
+          <w:numId w:val="15"/>
+        </w:numPr>
+        <w:spacing w:after="60" w:line="276" w:lineRule="auto"/>
         <w:rPr>
           <w:rFonts w:cs="Times New Roman"/>
           <w:sz w:val="24"/>
@@ -1957,6 +2148,12 @@
     </w:p>
     <w:p>
       <w:pPr>
+        <w:pStyle w:val="ListParagraph"/>
+        <w:numPr>
+          <w:ilvl w:val="0"/>
+          <w:numId w:val="12"/>
+        </w:numPr>
+        <w:spacing w:line="276" w:lineRule="auto"/>
         <w:rPr>
           <w:rFonts w:cs="Times New Roman"/>
           <w:sz w:val="24"/>
@@ -1974,8 +2171,7 @@
     </w:p>
     <w:p>
       <w:pPr>
-        <w:spacing w:after="200"/>
-        <w:jc w:val="center"/>
+        <w:spacing w:after="200" w:line="276" w:lineRule="auto"/>
         <w:rPr>
           <w:rFonts w:cs="Times New Roman"/>
           <w:sz w:val="28"/>
@@ -1995,7 +2191,7 @@
     </w:p>
     <w:p>
       <w:pPr>
-        <w:spacing w:after="200"/>
+        <w:spacing w:after="200" w:line="276" w:lineRule="auto"/>
         <w:jc w:val="center"/>
         <w:rPr>
           <w:rFonts w:cs="Times New Roman"/>
@@ -2016,7 +2212,7 @@
     </w:p>
     <w:p>
       <w:pPr>
-        <w:spacing w:after="200"/>
+        <w:spacing w:after="200" w:line="276" w:lineRule="auto"/>
         <w:jc w:val="center"/>
         <w:rPr>
           <w:rFonts w:cs="Times New Roman"/>
@@ -2027,6 +2223,7 @@
     </w:p>
     <w:p>
       <w:pPr>
+        <w:spacing w:line="276" w:lineRule="auto"/>
         <w:ind w:firstLine="259"/>
         <w:jc w:val="both"/>
         <w:rPr>
@@ -2046,6 +2243,7 @@
     </w:p>
     <w:p>
       <w:pPr>
+        <w:spacing w:line="276" w:lineRule="auto"/>
         <w:ind w:firstLine="259"/>
         <w:jc w:val="both"/>
         <w:rPr>
@@ -2065,6 +2263,7 @@
     </w:p>
     <w:p>
       <w:pPr>
+        <w:spacing w:line="276" w:lineRule="auto"/>
         <w:ind w:firstLine="259"/>
         <w:jc w:val="both"/>
         <w:rPr>
@@ -2081,16 +2280,14 @@
         </w:rPr>
         <w:t xml:space="preserve">Another expected outcome is the generation of a professional verification report that can be shared with relevant stakeholders. Buyers can use the report to identify questions before proceeding with a transaction, while lawyers and financial institutions can use it as an AI-assisted </w:t>
       </w:r>
-      <w:proofErr w:type="gramStart"/>
       <w:r>
         <w:rPr>
           <w:rFonts w:cs="Times New Roman"/>
           <w:sz w:val="24"/>
           <w:szCs w:val="24"/>
         </w:rPr>
-        <w:t>first-pass</w:t>
+        <w:t>first pass</w:t>
       </w:r>
-      <w:proofErr w:type="gramEnd"/>
       <w:r>
         <w:rPr>
           <w:rFonts w:cs="Times New Roman"/>
@@ -2102,6 +2299,7 @@
     </w:p>
     <w:p>
       <w:pPr>
+        <w:spacing w:line="276" w:lineRule="auto"/>
         <w:ind w:firstLine="259"/>
         <w:jc w:val="both"/>
         <w:rPr>
@@ -2121,6 +2319,7 @@
     </w:p>
     <w:p>
       <w:pPr>
+        <w:spacing w:line="276" w:lineRule="auto"/>
         <w:ind w:firstLine="259"/>
         <w:jc w:val="both"/>
         <w:rPr>
@@ -2140,6 +2339,37 @@
     </w:p>
     <w:p>
       <w:pPr>
+        <w:spacing w:line="276" w:lineRule="auto"/>
+        <w:rPr>
+          <w:rFonts w:cs="Times New Roman"/>
+          <w:sz w:val="24"/>
+          <w:szCs w:val="24"/>
+        </w:rPr>
+      </w:pPr>
+    </w:p>
+    <w:p>
+      <w:pPr>
+        <w:spacing w:line="276" w:lineRule="auto"/>
+        <w:rPr>
+          <w:rFonts w:cs="Times New Roman"/>
+          <w:sz w:val="24"/>
+          <w:szCs w:val="24"/>
+        </w:rPr>
+      </w:pPr>
+    </w:p>
+    <w:p>
+      <w:pPr>
+        <w:spacing w:line="276" w:lineRule="auto"/>
+        <w:rPr>
+          <w:rFonts w:cs="Times New Roman"/>
+          <w:sz w:val="24"/>
+          <w:szCs w:val="24"/>
+        </w:rPr>
+      </w:pPr>
+    </w:p>
+    <w:p>
+      <w:pPr>
+        <w:spacing w:line="276" w:lineRule="auto"/>
         <w:rPr>
           <w:rFonts w:cs="Times New Roman"/>
           <w:sz w:val="24"/>
@@ -2157,8 +2387,7 @@
     </w:p>
     <w:p>
       <w:pPr>
-        <w:spacing w:after="200"/>
-        <w:jc w:val="center"/>
+        <w:spacing w:after="200" w:line="276" w:lineRule="auto"/>
         <w:rPr>
           <w:rFonts w:cs="Times New Roman"/>
           <w:sz w:val="28"/>
@@ -2178,7 +2407,7 @@
     </w:p>
     <w:p>
       <w:pPr>
-        <w:spacing w:after="200"/>
+        <w:spacing w:after="200" w:line="276" w:lineRule="auto"/>
         <w:jc w:val="center"/>
         <w:rPr>
           <w:rFonts w:cs="Times New Roman"/>
@@ -2198,6 +2427,7 @@
     </w:p>
     <w:p>
       <w:pPr>
+        <w:spacing w:line="276" w:lineRule="auto"/>
         <w:ind w:firstLine="259"/>
         <w:jc w:val="both"/>
         <w:rPr>
@@ -2233,6 +2463,7 @@
     </w:p>
     <w:p>
       <w:pPr>
+        <w:spacing w:line="276" w:lineRule="auto"/>
         <w:ind w:firstLine="259"/>
         <w:jc w:val="both"/>
         <w:rPr>
@@ -2252,6 +2483,7 @@
     </w:p>
     <w:p>
       <w:pPr>
+        <w:spacing w:line="276" w:lineRule="auto"/>
         <w:ind w:firstLine="259"/>
         <w:jc w:val="both"/>
         <w:rPr>
@@ -2271,6 +2503,7 @@
     </w:p>
     <w:p>
       <w:pPr>
+        <w:spacing w:line="276" w:lineRule="auto"/>
         <w:ind w:firstLine="259"/>
         <w:jc w:val="both"/>
         <w:rPr>
@@ -2290,6 +2523,7 @@
     </w:p>
     <w:p>
       <w:pPr>
+        <w:spacing w:line="276" w:lineRule="auto"/>
         <w:rPr>
           <w:rFonts w:cs="Times New Roman"/>
           <w:sz w:val="24"/>
@@ -2307,7 +2541,7 @@
     </w:p>
     <w:p>
       <w:pPr>
-        <w:spacing w:after="200"/>
+        <w:spacing w:after="200" w:line="276" w:lineRule="auto"/>
         <w:jc w:val="center"/>
         <w:rPr>
           <w:rFonts w:cs="Times New Roman"/>
@@ -2328,7 +2562,7 @@
     </w:p>
     <w:p>
       <w:pPr>
-        <w:spacing w:after="160"/>
+        <w:spacing w:after="160" w:line="276" w:lineRule="auto"/>
         <w:ind w:left="216" w:hanging="216"/>
         <w:jc w:val="both"/>
         <w:rPr>
@@ -2343,44 +2577,12 @@
           <w:sz w:val="24"/>
           <w:szCs w:val="24"/>
         </w:rPr>
-        <w:t xml:space="preserve"> </w:t>
-      </w:r>
-      <w:r>
-        <w:rPr>
-          <w:rFonts w:cs="Times New Roman"/>
-          <w:sz w:val="24"/>
-          <w:szCs w:val="24"/>
-        </w:rPr>
-        <w:t>1</w:t>
-      </w:r>
-      <w:r>
-        <w:rPr>
-          <w:rFonts w:cs="Times New Roman"/>
-          <w:sz w:val="24"/>
-          <w:szCs w:val="24"/>
-        </w:rPr>
-        <w:t xml:space="preserve">. </w:t>
-      </w:r>
-      <w:r>
-        <w:rPr>
-          <w:rFonts w:cs="Times New Roman"/>
-          <w:sz w:val="24"/>
-          <w:szCs w:val="24"/>
-        </w:rPr>
-        <w:t>Premeasure</w:t>
-      </w:r>
-      <w:r>
-        <w:rPr>
-          <w:rFonts w:cs="Times New Roman"/>
-          <w:sz w:val="24"/>
-          <w:szCs w:val="24"/>
-        </w:rPr>
-        <w:t>, Damith, Tharindu Ranasinghe, Ruslan Mitkov, Mo El-Haj, et al. (2025). Survey on Legal Information Extraction: Current Status and Open Challenges. Knowledge and Information Systems, 67, 11287–11358.</w:t>
+        <w:t xml:space="preserve"> 1. Premeasure, Damith, Tharindu Ranasinghe, Ruslan Mitkov, Mo El-Haj, et al. (2025). Survey on Legal Information Extraction: Current Status and Open Challenges. Knowledge and Information Systems, 67, 11287–11358.</w:t>
       </w:r>
     </w:p>
     <w:p>
       <w:pPr>
-        <w:spacing w:after="160"/>
+        <w:spacing w:after="160" w:line="276" w:lineRule="auto"/>
         <w:ind w:left="216" w:hanging="216"/>
         <w:jc w:val="both"/>
         <w:rPr>
@@ -2395,36 +2597,12 @@
           <w:sz w:val="24"/>
           <w:szCs w:val="24"/>
         </w:rPr>
-        <w:t xml:space="preserve"> </w:t>
-      </w:r>
-      <w:r>
-        <w:rPr>
-          <w:rFonts w:cs="Times New Roman"/>
-          <w:sz w:val="24"/>
-          <w:szCs w:val="24"/>
-        </w:rPr>
-        <w:t>2</w:t>
-      </w:r>
-      <w:r>
-        <w:rPr>
-          <w:rFonts w:cs="Times New Roman"/>
-          <w:sz w:val="24"/>
-          <w:szCs w:val="24"/>
-        </w:rPr>
-        <w:t>.</w:t>
-      </w:r>
-      <w:r>
-        <w:rPr>
-          <w:rFonts w:cs="Times New Roman"/>
-          <w:sz w:val="24"/>
-          <w:szCs w:val="24"/>
-        </w:rPr>
-        <w:t xml:space="preserve"> Adhikary, Subinay, Procheta Sen, Dwaipayan Roy, et al. (2024). A Case Study for Automated Attribute Extraction from Legal Documents Using Large Language Models. Artificial Intelligence and Law, 34, 245–266.</w:t>
+        <w:t xml:space="preserve"> 2. Adhikary, Subinay, Procheta Sen, Dwaipayan Roy, et al. (2024). A Case Study for Automated Attribute Extraction from Legal Documents Using Large Language Models. Artificial Intelligence and Law, 34, 245–266.</w:t>
       </w:r>
     </w:p>
     <w:p>
       <w:pPr>
-        <w:spacing w:after="160"/>
+        <w:spacing w:after="160" w:line="276" w:lineRule="auto"/>
         <w:ind w:left="216" w:hanging="216"/>
         <w:jc w:val="both"/>
         <w:rPr>
@@ -2439,36 +2617,12 @@
           <w:sz w:val="24"/>
           <w:szCs w:val="24"/>
         </w:rPr>
-        <w:t xml:space="preserve"> </w:t>
-      </w:r>
-      <w:r>
-        <w:rPr>
-          <w:rFonts w:cs="Times New Roman"/>
-          <w:sz w:val="24"/>
-          <w:szCs w:val="24"/>
-        </w:rPr>
-        <w:t>3</w:t>
-      </w:r>
-      <w:r>
-        <w:rPr>
-          <w:rFonts w:cs="Times New Roman"/>
-          <w:sz w:val="24"/>
-          <w:szCs w:val="24"/>
-        </w:rPr>
-        <w:t>.</w:t>
-      </w:r>
-      <w:r>
-        <w:rPr>
-          <w:rFonts w:cs="Times New Roman"/>
-          <w:sz w:val="24"/>
-          <w:szCs w:val="24"/>
-        </w:rPr>
-        <w:t xml:space="preserve"> Nagaraja, S. R. &amp; Shushma, R. (2025). A Hybrid AI-Blockchain Framework with OCR, NER, and Anomaly Detection for Secure Land Record Management. Engineering, Technology &amp; Applied Science Research, 15(6), 30252–30259. DOI: 10.48084/etasr.15223.</w:t>
+        <w:t xml:space="preserve"> 3. Nagaraja, S. R. &amp; Shushma, R. (2025). A Hybrid AI-Blockchain Framework with OCR, NER, and Anomaly Detection for Secure Land Record Management. Engineering, Technology &amp; Applied Science Research, 15(6), 30252–30259. DOI: 10.48084/etasr.15223.</w:t>
       </w:r>
     </w:p>
     <w:p>
       <w:pPr>
-        <w:spacing w:after="160"/>
+        <w:spacing w:after="160" w:line="276" w:lineRule="auto"/>
         <w:ind w:left="216" w:hanging="216"/>
         <w:jc w:val="both"/>
         <w:rPr>
@@ -2483,31 +2637,7 @@
           <w:sz w:val="24"/>
           <w:szCs w:val="24"/>
         </w:rPr>
-        <w:t xml:space="preserve"> </w:t>
-      </w:r>
-      <w:r>
-        <w:rPr>
-          <w:rFonts w:cs="Times New Roman"/>
-          <w:sz w:val="24"/>
-          <w:szCs w:val="24"/>
-        </w:rPr>
-        <w:t>4</w:t>
-      </w:r>
-      <w:r>
-        <w:rPr>
-          <w:rFonts w:cs="Times New Roman"/>
-          <w:sz w:val="24"/>
-          <w:szCs w:val="24"/>
-        </w:rPr>
-        <w:t>.</w:t>
-      </w:r>
-      <w:r>
-        <w:rPr>
-          <w:rFonts w:cs="Times New Roman"/>
-          <w:sz w:val="24"/>
-          <w:szCs w:val="24"/>
-        </w:rPr>
-        <w:t xml:space="preserve"> Shen, Jiyuan, Yuan Peiyue, Atin Ghosh, Yifan Mai &amp; Daniel Dahlmeier. (2026). OCR or </w:t>
+        <w:t xml:space="preserve"> 4. Shen, Jiyuan, Yuan Peiyue, Atin Ghosh, Yifan Mai &amp; Daniel Dahlmeier. (2026). OCR or </w:t>
       </w:r>
       <w:proofErr w:type="gramStart"/>
       <w:r>
@@ -2532,7 +2662,7 @@
       <w:headerReference w:type="default" r:id="rId9"/>
       <w:footerReference w:type="default" r:id="rId10"/>
       <w:pgSz w:w="12240" w:h="15840"/>
-      <w:pgMar w:top="1037" w:right="1224" w:bottom="936" w:left="1224" w:header="454" w:footer="454" w:gutter="0"/>
+      <w:pgMar w:top="1474" w:right="1797" w:bottom="1622" w:left="1797" w:header="340" w:footer="340" w:gutter="0"/>
       <w:cols w:space="720"/>
       <w:docGrid w:linePitch="360"/>
     </w:sectPr>
@@ -2569,34 +2699,26 @@
 <w:ftr xmlns:wpc="http://schemas.microsoft.com/office/word/2010/wordprocessingCanvas" xmlns:cx="http://schemas.microsoft.com/office/drawing/2014/chartex" xmlns:cx1="http://schemas.microsoft.com/office/drawing/2015/9/8/chartex" xmlns:cx2="http://schemas.microsoft.com/office/drawing/2015/10/21/chartex" xmlns:cx3="http://schemas.microsoft.com/office/drawing/2016/5/9/chartex" xmlns:cx4="http://schemas.microsoft.com/office/drawing/2016/5/10/chartex" xmlns:cx5="http://schemas.microsoft.com/office/drawing/2016/5/11/chartex" xmlns:cx6="http://schemas.microsoft.com/office/drawing/2016/5/12/chartex" xmlns:cx7="http://schemas.microsoft.com/office/drawing/2016/5/13/chartex" xmlns:cx8="http://schemas.microsoft.com/office/drawing/2016/5/14/chartex" xmlns:mc="http://schemas.openxmlformats.org/markup-compatibility/2006" xmlns:aink="http://schemas.microsoft.com/office/drawing/2016/ink" xmlns:am3d="http://schemas.microsoft.com/office/drawing/2017/model3d" xmlns:o="urn:schemas-microsoft-com:office:office" xmlns:oel="http://schemas.microsoft.com/office/2019/extlst" xmlns:r="http://schemas.openxmlformats.org/officeDocument/2006/relationships" xmlns:m="http://schemas.openxmlformats.org/officeDocument/2006/math" xmlns:v="urn:schemas-microsoft-com:vml" xmlns:wp14="http://schemas.microsoft.com/office/word/2010/wordprocessingDrawing" xmlns:wp="http://schemas.openxmlformats.org/drawingml/2006/wordprocessingDrawing" xmlns:w10="urn:schemas-microsoft-com:office:word" xmlns:w="http://schemas.openxmlformats.org/wordprocessingml/2006/main" xmlns:w14="http://schemas.microsoft.com/office/word/2010/wordml" xmlns:w15="http://schemas.microsoft.com/office/word/2012/wordml" xmlns:w16cex="http://schemas.microsoft.com/office/word/2018/wordml/cex" xmlns:w16cid="http://schemas.microsoft.com/office/word/2016/wordml/cid" xmlns:w16="http://schemas.microsoft.com/office/word/2018/wordml" xmlns:w16du="http://schemas.microsoft.com/office/word/2023/wordml/word16du" xmlns:w16sdtdh="http://schemas.microsoft.com/office/word/2020/wordml/sdtdatahash" xmlns:w16sdtfl="http://schemas.microsoft.com/office/word/2024/wordml/sdtformatlock" xmlns:w16se="http://schemas.microsoft.com/office/word/2015/wordml/symex" xmlns:wpg="http://schemas.microsoft.com/office/word/2010/wordprocessingGroup" xmlns:wpi="http://schemas.microsoft.com/office/word/2010/wordprocessingInk" xmlns:wne="http://schemas.microsoft.com/office/word/2006/wordml" xmlns:wps="http://schemas.microsoft.com/office/word/2010/wordprocessingShape" mc:Ignorable="w14 w15 w16se w16cid w16 w16cex w16sdtdh w16sdtfl w16du wp14">
   <w:p>
     <w:pPr>
-      <w:pStyle w:val="Footer"/>
-      <w:pBdr>
-        <w:top w:val="single" w:sz="8" w:space="3" w:color="7A1F2B"/>
-      </w:pBdr>
-      <w:jc w:val="center"/>
+      <w:pStyle w:val="NoSpacing"/>
       <w:rPr>
         <w:color w:val="000000" w:themeColor="text1"/>
       </w:rPr>
     </w:pPr>
     <w:r>
-      <w:rPr>
-        <w:rFonts w:ascii="Calibri" w:eastAsia="Calibri" w:hAnsi="Calibri" w:cs="Calibri"/>
-        <w:noProof/>
-      </w:rPr>
       <mc:AlternateContent>
         <mc:Choice Requires="wpg">
           <w:drawing>
-            <wp:anchor distT="0" distB="0" distL="114300" distR="114300" simplePos="0" relativeHeight="251661312" behindDoc="0" locked="0" layoutInCell="1" allowOverlap="1" wp14:anchorId="7C10D6CA" wp14:editId="7B181E3F">
+            <wp:anchor distT="0" distB="0" distL="114300" distR="114300" simplePos="0" relativeHeight="251661312" behindDoc="0" locked="0" layoutInCell="1" allowOverlap="1" wp14:anchorId="7C10D6CA" wp14:editId="1FF59474">
               <wp:simplePos x="0" y="0"/>
               <wp:positionH relativeFrom="margin">
-                <wp:align>right</wp:align>
+                <wp:align>left</wp:align>
               </wp:positionH>
               <wp:positionV relativeFrom="paragraph">
-                <wp:posOffset>31750</wp:posOffset>
+                <wp:posOffset>-80010</wp:posOffset>
               </wp:positionV>
-              <wp:extent cx="6217920" cy="60960"/>
-              <wp:effectExtent l="0" t="0" r="0" b="15240"/>
-              <wp:wrapSquare wrapText="bothSides"/>
+              <wp:extent cx="5494020" cy="45719"/>
+              <wp:effectExtent l="0" t="0" r="0" b="12065"/>
+              <wp:wrapTopAndBottom/>
               <wp:docPr id="446011139" name="Group 446011139"/>
               <wp:cNvGraphicFramePr/>
               <a:graphic xmlns:a="http://schemas.openxmlformats.org/drawingml/2006/main">
@@ -2606,7 +2728,7 @@
                     <wpg:grpSpPr>
                       <a:xfrm>
                         <a:off x="0" y="0"/>
-                        <a:ext cx="6217920" cy="60960"/>
+                        <a:ext cx="5494020" cy="45719"/>
                         <a:chOff x="0" y="0"/>
                         <a:chExt cx="5539105" cy="56388"/>
                       </a:xfrm>
@@ -2733,7 +2855,7 @@
         </mc:Choice>
         <mc:Fallback>
           <w:pict>
-            <v:group w14:anchorId="3DC7B353" id="Group 446011139" o:spid="_x0000_s1026" style="position:absolute;margin-left:438.4pt;margin-top:2.5pt;width:489.6pt;height:4.8pt;z-index:251661312;mso-position-horizontal:right;mso-position-horizontal-relative:margin;mso-width-relative:margin;mso-height-relative:margin" coordsize="55391,563" o:gfxdata="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">
+            <v:group w14:anchorId="637490CD" id="Group 446011139" o:spid="_x0000_s1026" style="position:absolute;margin-left:0;margin-top:-6.3pt;width:432.6pt;height:3.6pt;z-index:251661312;mso-position-horizontal:left;mso-position-horizontal-relative:margin;mso-width-relative:margin;mso-height-relative:margin" coordsize="55391,563" o:gfxdata="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">
               <v:shape id="Shape 8884" o:spid="_x0000_s1027" style="position:absolute;width:55391;height:381;visibility:visible;mso-wrap-style:square;v-text-anchor:top" coordsize="5539105,38100" o:gfxdata="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" path="m,l5539105,r,38100l,38100,,e" fillcolor="#622423" stroked="f" strokeweight="0">
                 <v:stroke miterlimit="83231f" joinstyle="miter"/>
                 <v:path arrowok="t" textboxrect="0,0,5539105,38100"/>
@@ -2742,18 +2864,33 @@
                 <v:stroke miterlimit="83231f" joinstyle="miter"/>
                 <v:path arrowok="t" textboxrect="0,0,5539105,9144"/>
               </v:shape>
-              <w10:wrap type="square" anchorx="margin"/>
+              <w10:wrap type="topAndBottom" anchorx="margin"/>
             </v:group>
           </w:pict>
         </mc:Fallback>
       </mc:AlternateContent>
     </w:r>
     <w:r>
+      <w:t xml:space="preserve">CSE-IY/CY DEPT, GMU DVG    </w:t>
+    </w:r>
+    <w:r>
+      <w:t xml:space="preserve">                           </w:t>
+    </w:r>
+    <w:r>
+      <w:t xml:space="preserve">                       </w:t>
+    </w:r>
+    <w:r>
+      <w:t xml:space="preserve">                                     </w:t>
+    </w:r>
+    <w:r>
+      <w:t xml:space="preserve">                       </w:t>
+    </w:r>
+    <w:r>
       <w:rPr>
         <w:color w:val="000000" w:themeColor="text1"/>
         <w:sz w:val="18"/>
       </w:rPr>
-      <w:t xml:space="preserve">CSE-IY/CY DEPT, GMU DVG                                                       Page </w:t>
+      <w:t xml:space="preserve">Page </w:t>
     </w:r>
     <w:r>
       <w:rPr>
@@ -2819,16 +2956,7 @@
 <w:hdr xmlns:wpc="http://schemas.microsoft.com/office/word/2010/wordprocessingCanvas" xmlns:cx="http://schemas.microsoft.com/office/drawing/2014/chartex" xmlns:cx1="http://schemas.microsoft.com/office/drawing/2015/9/8/chartex" xmlns:cx2="http://schemas.microsoft.com/office/drawing/2015/10/21/chartex" xmlns:cx3="http://schemas.microsoft.com/office/drawing/2016/5/9/chartex" xmlns:cx4="http://schemas.microsoft.com/office/drawing/2016/5/10/chartex" xmlns:cx5="http://schemas.microsoft.com/office/drawing/2016/5/11/chartex" xmlns:cx6="http://schemas.microsoft.com/office/drawing/2016/5/12/chartex" xmlns:cx7="http://schemas.microsoft.com/office/drawing/2016/5/13/chartex" xmlns:cx8="http://schemas.microsoft.com/office/drawing/2016/5/14/chartex" xmlns:mc="http://schemas.openxmlformats.org/markup-compatibility/2006" xmlns:aink="http://schemas.microsoft.com/office/drawing/2016/ink" xmlns:am3d="http://schemas.microsoft.com/office/drawing/2017/model3d" xmlns:o="urn:schemas-microsoft-com:office:office" xmlns:oel="http://schemas.microsoft.com/office/2019/extlst" xmlns:r="http://schemas.openxmlformats.org/officeDocument/2006/relationships" xmlns:m="http://schemas.openxmlformats.org/officeDocument/2006/math" xmlns:v="urn:schemas-microsoft-com:vml" xmlns:wp14="http://schemas.microsoft.com/office/word/2010/wordprocessingDrawing" xmlns:wp="http://schemas.openxmlformats.org/drawingml/2006/wordprocessingDrawing" xmlns:w10="urn:schemas-microsoft-com:office:word" xmlns:w="http://schemas.openxmlformats.org/wordprocessingml/2006/main" xmlns:w14="http://schemas.microsoft.com/office/word/2010/wordml" xmlns:w15="http://schemas.microsoft.com/office/word/2012/wordml" xmlns:w16cex="http://schemas.microsoft.com/office/word/2018/wordml/cex" xmlns:w16cid="http://schemas.microsoft.com/office/word/2016/wordml/cid" xmlns:w16="http://schemas.microsoft.com/office/word/2018/wordml" xmlns:w16du="http://schemas.microsoft.com/office/word/2023/wordml/word16du" xmlns:w16sdtdh="http://schemas.microsoft.com/office/word/2020/wordml/sdtdatahash" xmlns:w16sdtfl="http://schemas.microsoft.com/office/word/2024/wordml/sdtformatlock" xmlns:w16se="http://schemas.microsoft.com/office/word/2015/wordml/symex" xmlns:wpg="http://schemas.microsoft.com/office/word/2010/wordprocessingGroup" xmlns:wpi="http://schemas.microsoft.com/office/word/2010/wordprocessingInk" xmlns:wne="http://schemas.microsoft.com/office/word/2006/wordml" xmlns:wps="http://schemas.microsoft.com/office/word/2010/wordprocessingShape" mc:Ignorable="w14 w15 w16se w16cid w16 w16cex w16sdtdh w16sdtfl w16du wp14">
   <w:p>
     <w:pPr>
-      <w:pStyle w:val="Header"/>
-      <w:pBdr>
-        <w:bottom w:val="single" w:sz="8" w:space="3" w:color="7A1F2B"/>
-      </w:pBdr>
-      <w:jc w:val="center"/>
-      <w:rPr>
-        <w:b/>
-        <w:color w:val="000000" w:themeColor="text1"/>
-        <w:sz w:val="21"/>
-      </w:rPr>
+      <w:jc w:val="right"/>
     </w:pPr>
     <w:r>
       <w:rPr>
@@ -2838,33 +2966,33 @@
       <mc:AlternateContent>
         <mc:Choice Requires="wpg">
           <w:drawing>
-            <wp:anchor distT="0" distB="0" distL="114300" distR="114300" simplePos="0" relativeHeight="251659264" behindDoc="0" locked="0" layoutInCell="1" allowOverlap="1" wp14:anchorId="06B68B06" wp14:editId="098B00DB">
+            <wp:anchor distT="0" distB="0" distL="114300" distR="114300" simplePos="0" relativeHeight="251663360" behindDoc="0" locked="0" layoutInCell="1" allowOverlap="1" wp14:anchorId="05224CB0" wp14:editId="616CD3EC">
               <wp:simplePos x="0" y="0"/>
               <wp:positionH relativeFrom="margin">
-                <wp:posOffset>0</wp:posOffset>
+                <wp:align>right</wp:align>
               </wp:positionH>
-              <wp:positionV relativeFrom="page">
-                <wp:posOffset>510540</wp:posOffset>
+              <wp:positionV relativeFrom="paragraph">
+                <wp:posOffset>210185</wp:posOffset>
               </wp:positionV>
-              <wp:extent cx="6217920" cy="56515"/>
-              <wp:effectExtent l="0" t="0" r="0" b="635"/>
-              <wp:wrapSquare wrapText="bothSides"/>
-              <wp:docPr id="8441" name="Group 8441"/>
+              <wp:extent cx="5486400" cy="45085"/>
+              <wp:effectExtent l="0" t="0" r="0" b="0"/>
+              <wp:wrapTopAndBottom/>
+              <wp:docPr id="1378482212" name="Group 1378482212"/>
               <wp:cNvGraphicFramePr/>
               <a:graphic xmlns:a="http://schemas.openxmlformats.org/drawingml/2006/main">
                 <a:graphicData uri="http://schemas.microsoft.com/office/word/2010/wordprocessingGroup">
                   <wpg:wgp>
                     <wpg:cNvGrpSpPr/>
                     <wpg:grpSpPr>
-                      <a:xfrm>
+                      <a:xfrm flipV="1">
                         <a:off x="0" y="0"/>
-                        <a:ext cx="6217920" cy="56515"/>
+                        <a:ext cx="5486400" cy="45085"/>
                         <a:chOff x="0" y="0"/>
                         <a:chExt cx="5539105" cy="56388"/>
                       </a:xfrm>
                     </wpg:grpSpPr>
                     <wps:wsp>
-                      <wps:cNvPr id="8884" name="Shape 8884"/>
+                      <wps:cNvPr id="1868512984" name="Shape 8884"/>
                       <wps:cNvSpPr/>
                       <wps:spPr>
                         <a:xfrm>
@@ -2918,7 +3046,7 @@
                       <wps:bodyPr/>
                     </wps:wsp>
                     <wps:wsp>
-                      <wps:cNvPr id="8885" name="Shape 8885"/>
+                      <wps:cNvPr id="686081456" name="Shape 8885"/>
                       <wps:cNvSpPr/>
                       <wps:spPr>
                         <a:xfrm>
@@ -2985,27 +3113,22 @@
         </mc:Choice>
         <mc:Fallback>
           <w:pict>
-            <v:group w14:anchorId="0038D947" id="Group 8441" o:spid="_x0000_s1026" style="position:absolute;margin-left:0;margin-top:40.2pt;width:489.6pt;height:4.45pt;z-index:251659264;mso-position-horizontal-relative:margin;mso-position-vertical-relative:page;mso-width-relative:margin;mso-height-relative:margin" coordsize="55391,563" o:gfxdata="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">
-              <v:shape id="Shape 8884" o:spid="_x0000_s1027" style="position:absolute;width:55391;height:381;visibility:visible;mso-wrap-style:square;v-text-anchor:top" coordsize="5539105,38100" o:gfxdata="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" path="m,l5539105,r,38100l,38100,,e" fillcolor="#622423" stroked="f" strokeweight="0">
+            <v:group w14:anchorId="23635A32" id="Group 1378482212" o:spid="_x0000_s1026" style="position:absolute;margin-left:380.8pt;margin-top:16.55pt;width:6in;height:3.55pt;flip:y;z-index:251663360;mso-position-horizontal:right;mso-position-horizontal-relative:margin;mso-width-relative:margin;mso-height-relative:margin" coordsize="55391,563" o:gfxdata="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">
+              <v:shape id="Shape 8884" o:spid="_x0000_s1027" style="position:absolute;width:55391;height:381;visibility:visible;mso-wrap-style:square;v-text-anchor:top" coordsize="5539105,38100" o:gfxdata="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" path="m,l5539105,r,38100l,38100,,e" fillcolor="#622423" stroked="f" strokeweight="0">
                 <v:stroke miterlimit="83231f" joinstyle="miter"/>
                 <v:path arrowok="t" textboxrect="0,0,5539105,38100"/>
               </v:shape>
-              <v:shape id="Shape 8885" o:spid="_x0000_s1028" style="position:absolute;top:472;width:55391;height:91;visibility:visible;mso-wrap-style:square;v-text-anchor:top" coordsize="5539105,9144" o:gfxdata="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" path="m,l5539105,r,9144l,9144,,e" fillcolor="#622423" stroked="f" strokeweight="0">
+              <v:shape id="Shape 8885" o:spid="_x0000_s1028" style="position:absolute;top:472;width:55391;height:91;visibility:visible;mso-wrap-style:square;v-text-anchor:top" coordsize="5539105,9144" o:gfxdata="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" path="m,l5539105,r,9144l,9144,,e" fillcolor="#622423" stroked="f" strokeweight="0">
                 <v:stroke miterlimit="83231f" joinstyle="miter"/>
                 <v:path arrowok="t" textboxrect="0,0,5539105,9144"/>
               </v:shape>
-              <w10:wrap type="square" anchorx="margin" anchory="page"/>
+              <w10:wrap type="topAndBottom" anchorx="margin"/>
             </v:group>
           </w:pict>
         </mc:Fallback>
       </mc:AlternateContent>
     </w:r>
     <w:r>
-      <w:rPr>
-        <w:b/>
-        <w:color w:val="000000" w:themeColor="text1"/>
-        <w:sz w:val="21"/>
-      </w:rPr>
       <w:t>AI-Powered Property Verification</w:t>
     </w:r>
   </w:p>
@@ -3167,7 +3290,7 @@
   <w:abstractNum w:abstractNumId="8" w15:restartNumberingAfterBreak="0">
     <w:nsid w:val="FFFFFF89"/>
     <w:multiLevelType w:val="singleLevel"/>
-    <w:tmpl w:val="29761A62"/>
+    <w:tmpl w:val="5B94D95E"/>
     <w:lvl w:ilvl="0">
       <w:start w:val="1"/>
       <w:numFmt w:val="bullet"/>
@@ -3182,6 +3305,1023 @@
       </w:pPr>
       <w:rPr>
         <w:rFonts w:ascii="Symbol" w:hAnsi="Symbol" w:hint="default"/>
+      </w:rPr>
+    </w:lvl>
+  </w:abstractNum>
+  <w:abstractNum w:abstractNumId="9" w15:restartNumberingAfterBreak="0">
+    <w:nsid w:val="160155F2"/>
+    <w:multiLevelType w:val="hybridMultilevel"/>
+    <w:tmpl w:val="CD1AF16E"/>
+    <w:lvl w:ilvl="0" w:tplc="40090001">
+      <w:start w:val="1"/>
+      <w:numFmt w:val="bullet"/>
+      <w:lvlText w:val=""/>
+      <w:lvlJc w:val="left"/>
+      <w:pPr>
+        <w:ind w:left="720" w:hanging="360"/>
+      </w:pPr>
+      <w:rPr>
+        <w:rFonts w:ascii="Symbol" w:hAnsi="Symbol" w:hint="default"/>
+      </w:rPr>
+    </w:lvl>
+    <w:lvl w:ilvl="1" w:tplc="40090003" w:tentative="1">
+      <w:start w:val="1"/>
+      <w:numFmt w:val="bullet"/>
+      <w:lvlText w:val="o"/>
+      <w:lvlJc w:val="left"/>
+      <w:pPr>
+        <w:ind w:left="1440" w:hanging="360"/>
+      </w:pPr>
+      <w:rPr>
+        <w:rFonts w:ascii="Courier New" w:hAnsi="Courier New" w:cs="Courier New" w:hint="default"/>
+      </w:rPr>
+    </w:lvl>
+    <w:lvl w:ilvl="2" w:tplc="40090005" w:tentative="1">
+      <w:start w:val="1"/>
+      <w:numFmt w:val="bullet"/>
+      <w:lvlText w:val=""/>
+      <w:lvlJc w:val="left"/>
+      <w:pPr>
+        <w:ind w:left="2160" w:hanging="360"/>
+      </w:pPr>
+      <w:rPr>
+        <w:rFonts w:ascii="Wingdings" w:hAnsi="Wingdings" w:hint="default"/>
+      </w:rPr>
+    </w:lvl>
+    <w:lvl w:ilvl="3" w:tplc="40090001" w:tentative="1">
+      <w:start w:val="1"/>
+      <w:numFmt w:val="bullet"/>
+      <w:lvlText w:val=""/>
+      <w:lvlJc w:val="left"/>
+      <w:pPr>
+        <w:ind w:left="2880" w:hanging="360"/>
+      </w:pPr>
+      <w:rPr>
+        <w:rFonts w:ascii="Symbol" w:hAnsi="Symbol" w:hint="default"/>
+      </w:rPr>
+    </w:lvl>
+    <w:lvl w:ilvl="4" w:tplc="40090003" w:tentative="1">
+      <w:start w:val="1"/>
+      <w:numFmt w:val="bullet"/>
+      <w:lvlText w:val="o"/>
+      <w:lvlJc w:val="left"/>
+      <w:pPr>
+        <w:ind w:left="3600" w:hanging="360"/>
+      </w:pPr>
+      <w:rPr>
+        <w:rFonts w:ascii="Courier New" w:hAnsi="Courier New" w:cs="Courier New" w:hint="default"/>
+      </w:rPr>
+    </w:lvl>
+    <w:lvl w:ilvl="5" w:tplc="40090005" w:tentative="1">
+      <w:start w:val="1"/>
+      <w:numFmt w:val="bullet"/>
+      <w:lvlText w:val=""/>
+      <w:lvlJc w:val="left"/>
+      <w:pPr>
+        <w:ind w:left="4320" w:hanging="360"/>
+      </w:pPr>
+      <w:rPr>
+        <w:rFonts w:ascii="Wingdings" w:hAnsi="Wingdings" w:hint="default"/>
+      </w:rPr>
+    </w:lvl>
+    <w:lvl w:ilvl="6" w:tplc="40090001" w:tentative="1">
+      <w:start w:val="1"/>
+      <w:numFmt w:val="bullet"/>
+      <w:lvlText w:val=""/>
+      <w:lvlJc w:val="left"/>
+      <w:pPr>
+        <w:ind w:left="5040" w:hanging="360"/>
+      </w:pPr>
+      <w:rPr>
+        <w:rFonts w:ascii="Symbol" w:hAnsi="Symbol" w:hint="default"/>
+      </w:rPr>
+    </w:lvl>
+    <w:lvl w:ilvl="7" w:tplc="40090003" w:tentative="1">
+      <w:start w:val="1"/>
+      <w:numFmt w:val="bullet"/>
+      <w:lvlText w:val="o"/>
+      <w:lvlJc w:val="left"/>
+      <w:pPr>
+        <w:ind w:left="5760" w:hanging="360"/>
+      </w:pPr>
+      <w:rPr>
+        <w:rFonts w:ascii="Courier New" w:hAnsi="Courier New" w:cs="Courier New" w:hint="default"/>
+      </w:rPr>
+    </w:lvl>
+    <w:lvl w:ilvl="8" w:tplc="40090005" w:tentative="1">
+      <w:start w:val="1"/>
+      <w:numFmt w:val="bullet"/>
+      <w:lvlText w:val=""/>
+      <w:lvlJc w:val="left"/>
+      <w:pPr>
+        <w:ind w:left="6480" w:hanging="360"/>
+      </w:pPr>
+      <w:rPr>
+        <w:rFonts w:ascii="Wingdings" w:hAnsi="Wingdings" w:hint="default"/>
+      </w:rPr>
+    </w:lvl>
+  </w:abstractNum>
+  <w:abstractNum w:abstractNumId="10" w15:restartNumberingAfterBreak="0">
+    <w:nsid w:val="4B635A77"/>
+    <w:multiLevelType w:val="hybridMultilevel"/>
+    <w:tmpl w:val="ADDEC51E"/>
+    <w:lvl w:ilvl="0" w:tplc="40090001">
+      <w:start w:val="1"/>
+      <w:numFmt w:val="bullet"/>
+      <w:lvlText w:val=""/>
+      <w:lvlJc w:val="left"/>
+      <w:pPr>
+        <w:ind w:left="950" w:hanging="360"/>
+      </w:pPr>
+      <w:rPr>
+        <w:rFonts w:ascii="Symbol" w:hAnsi="Symbol" w:hint="default"/>
+      </w:rPr>
+    </w:lvl>
+    <w:lvl w:ilvl="1" w:tplc="40090003" w:tentative="1">
+      <w:start w:val="1"/>
+      <w:numFmt w:val="bullet"/>
+      <w:lvlText w:val="o"/>
+      <w:lvlJc w:val="left"/>
+      <w:pPr>
+        <w:ind w:left="1670" w:hanging="360"/>
+      </w:pPr>
+      <w:rPr>
+        <w:rFonts w:ascii="Courier New" w:hAnsi="Courier New" w:cs="Courier New" w:hint="default"/>
+      </w:rPr>
+    </w:lvl>
+    <w:lvl w:ilvl="2" w:tplc="40090005" w:tentative="1">
+      <w:start w:val="1"/>
+      <w:numFmt w:val="bullet"/>
+      <w:lvlText w:val=""/>
+      <w:lvlJc w:val="left"/>
+      <w:pPr>
+        <w:ind w:left="2390" w:hanging="360"/>
+      </w:pPr>
+      <w:rPr>
+        <w:rFonts w:ascii="Wingdings" w:hAnsi="Wingdings" w:hint="default"/>
+      </w:rPr>
+    </w:lvl>
+    <w:lvl w:ilvl="3" w:tplc="40090001" w:tentative="1">
+      <w:start w:val="1"/>
+      <w:numFmt w:val="bullet"/>
+      <w:lvlText w:val=""/>
+      <w:lvlJc w:val="left"/>
+      <w:pPr>
+        <w:ind w:left="3110" w:hanging="360"/>
+      </w:pPr>
+      <w:rPr>
+        <w:rFonts w:ascii="Symbol" w:hAnsi="Symbol" w:hint="default"/>
+      </w:rPr>
+    </w:lvl>
+    <w:lvl w:ilvl="4" w:tplc="40090003" w:tentative="1">
+      <w:start w:val="1"/>
+      <w:numFmt w:val="bullet"/>
+      <w:lvlText w:val="o"/>
+      <w:lvlJc w:val="left"/>
+      <w:pPr>
+        <w:ind w:left="3830" w:hanging="360"/>
+      </w:pPr>
+      <w:rPr>
+        <w:rFonts w:ascii="Courier New" w:hAnsi="Courier New" w:cs="Courier New" w:hint="default"/>
+      </w:rPr>
+    </w:lvl>
+    <w:lvl w:ilvl="5" w:tplc="40090005" w:tentative="1">
+      <w:start w:val="1"/>
+      <w:numFmt w:val="bullet"/>
+      <w:lvlText w:val=""/>
+      <w:lvlJc w:val="left"/>
+      <w:pPr>
+        <w:ind w:left="4550" w:hanging="360"/>
+      </w:pPr>
+      <w:rPr>
+        <w:rFonts w:ascii="Wingdings" w:hAnsi="Wingdings" w:hint="default"/>
+      </w:rPr>
+    </w:lvl>
+    <w:lvl w:ilvl="6" w:tplc="40090001" w:tentative="1">
+      <w:start w:val="1"/>
+      <w:numFmt w:val="bullet"/>
+      <w:lvlText w:val=""/>
+      <w:lvlJc w:val="left"/>
+      <w:pPr>
+        <w:ind w:left="5270" w:hanging="360"/>
+      </w:pPr>
+      <w:rPr>
+        <w:rFonts w:ascii="Symbol" w:hAnsi="Symbol" w:hint="default"/>
+      </w:rPr>
+    </w:lvl>
+    <w:lvl w:ilvl="7" w:tplc="40090003" w:tentative="1">
+      <w:start w:val="1"/>
+      <w:numFmt w:val="bullet"/>
+      <w:lvlText w:val="o"/>
+      <w:lvlJc w:val="left"/>
+      <w:pPr>
+        <w:ind w:left="5990" w:hanging="360"/>
+      </w:pPr>
+      <w:rPr>
+        <w:rFonts w:ascii="Courier New" w:hAnsi="Courier New" w:cs="Courier New" w:hint="default"/>
+      </w:rPr>
+    </w:lvl>
+    <w:lvl w:ilvl="8" w:tplc="40090005" w:tentative="1">
+      <w:start w:val="1"/>
+      <w:numFmt w:val="bullet"/>
+      <w:lvlText w:val=""/>
+      <w:lvlJc w:val="left"/>
+      <w:pPr>
+        <w:ind w:left="6710" w:hanging="360"/>
+      </w:pPr>
+      <w:rPr>
+        <w:rFonts w:ascii="Wingdings" w:hAnsi="Wingdings" w:hint="default"/>
+      </w:rPr>
+    </w:lvl>
+  </w:abstractNum>
+  <w:abstractNum w:abstractNumId="11" w15:restartNumberingAfterBreak="0">
+    <w:nsid w:val="54201A4A"/>
+    <w:multiLevelType w:val="hybridMultilevel"/>
+    <w:tmpl w:val="5C68974E"/>
+    <w:lvl w:ilvl="0" w:tplc="40090001">
+      <w:start w:val="1"/>
+      <w:numFmt w:val="bullet"/>
+      <w:lvlText w:val=""/>
+      <w:lvlJc w:val="left"/>
+      <w:pPr>
+        <w:ind w:left="720" w:hanging="360"/>
+      </w:pPr>
+      <w:rPr>
+        <w:rFonts w:ascii="Symbol" w:hAnsi="Symbol" w:hint="default"/>
+      </w:rPr>
+    </w:lvl>
+    <w:lvl w:ilvl="1" w:tplc="40090003" w:tentative="1">
+      <w:start w:val="1"/>
+      <w:numFmt w:val="bullet"/>
+      <w:lvlText w:val="o"/>
+      <w:lvlJc w:val="left"/>
+      <w:pPr>
+        <w:ind w:left="1440" w:hanging="360"/>
+      </w:pPr>
+      <w:rPr>
+        <w:rFonts w:ascii="Courier New" w:hAnsi="Courier New" w:cs="Courier New" w:hint="default"/>
+      </w:rPr>
+    </w:lvl>
+    <w:lvl w:ilvl="2" w:tplc="40090005" w:tentative="1">
+      <w:start w:val="1"/>
+      <w:numFmt w:val="bullet"/>
+      <w:lvlText w:val=""/>
+      <w:lvlJc w:val="left"/>
+      <w:pPr>
+        <w:ind w:left="2160" w:hanging="360"/>
+      </w:pPr>
+      <w:rPr>
+        <w:rFonts w:ascii="Wingdings" w:hAnsi="Wingdings" w:hint="default"/>
+      </w:rPr>
+    </w:lvl>
+    <w:lvl w:ilvl="3" w:tplc="40090001" w:tentative="1">
+      <w:start w:val="1"/>
+      <w:numFmt w:val="bullet"/>
+      <w:lvlText w:val=""/>
+      <w:lvlJc w:val="left"/>
+      <w:pPr>
+        <w:ind w:left="2880" w:hanging="360"/>
+      </w:pPr>
+      <w:rPr>
+        <w:rFonts w:ascii="Symbol" w:hAnsi="Symbol" w:hint="default"/>
+      </w:rPr>
+    </w:lvl>
+    <w:lvl w:ilvl="4" w:tplc="40090003" w:tentative="1">
+      <w:start w:val="1"/>
+      <w:numFmt w:val="bullet"/>
+      <w:lvlText w:val="o"/>
+      <w:lvlJc w:val="left"/>
+      <w:pPr>
+        <w:ind w:left="3600" w:hanging="360"/>
+      </w:pPr>
+      <w:rPr>
+        <w:rFonts w:ascii="Courier New" w:hAnsi="Courier New" w:cs="Courier New" w:hint="default"/>
+      </w:rPr>
+    </w:lvl>
+    <w:lvl w:ilvl="5" w:tplc="40090005" w:tentative="1">
+      <w:start w:val="1"/>
+      <w:numFmt w:val="bullet"/>
+      <w:lvlText w:val=""/>
+      <w:lvlJc w:val="left"/>
+      <w:pPr>
+        <w:ind w:left="4320" w:hanging="360"/>
+      </w:pPr>
+      <w:rPr>
+        <w:rFonts w:ascii="Wingdings" w:hAnsi="Wingdings" w:hint="default"/>
+      </w:rPr>
+    </w:lvl>
+    <w:lvl w:ilvl="6" w:tplc="40090001" w:tentative="1">
+      <w:start w:val="1"/>
+      <w:numFmt w:val="bullet"/>
+      <w:lvlText w:val=""/>
+      <w:lvlJc w:val="left"/>
+      <w:pPr>
+        <w:ind w:left="5040" w:hanging="360"/>
+      </w:pPr>
+      <w:rPr>
+        <w:rFonts w:ascii="Symbol" w:hAnsi="Symbol" w:hint="default"/>
+      </w:rPr>
+    </w:lvl>
+    <w:lvl w:ilvl="7" w:tplc="40090003" w:tentative="1">
+      <w:start w:val="1"/>
+      <w:numFmt w:val="bullet"/>
+      <w:lvlText w:val="o"/>
+      <w:lvlJc w:val="left"/>
+      <w:pPr>
+        <w:ind w:left="5760" w:hanging="360"/>
+      </w:pPr>
+      <w:rPr>
+        <w:rFonts w:ascii="Courier New" w:hAnsi="Courier New" w:cs="Courier New" w:hint="default"/>
+      </w:rPr>
+    </w:lvl>
+    <w:lvl w:ilvl="8" w:tplc="40090005" w:tentative="1">
+      <w:start w:val="1"/>
+      <w:numFmt w:val="bullet"/>
+      <w:lvlText w:val=""/>
+      <w:lvlJc w:val="left"/>
+      <w:pPr>
+        <w:ind w:left="6480" w:hanging="360"/>
+      </w:pPr>
+      <w:rPr>
+        <w:rFonts w:ascii="Wingdings" w:hAnsi="Wingdings" w:hint="default"/>
+      </w:rPr>
+    </w:lvl>
+  </w:abstractNum>
+  <w:abstractNum w:abstractNumId="12" w15:restartNumberingAfterBreak="0">
+    <w:nsid w:val="57AE75BC"/>
+    <w:multiLevelType w:val="hybridMultilevel"/>
+    <w:tmpl w:val="E9A27100"/>
+    <w:lvl w:ilvl="0" w:tplc="40090001">
+      <w:start w:val="1"/>
+      <w:numFmt w:val="bullet"/>
+      <w:lvlText w:val=""/>
+      <w:lvlJc w:val="left"/>
+      <w:pPr>
+        <w:ind w:left="720" w:hanging="360"/>
+      </w:pPr>
+      <w:rPr>
+        <w:rFonts w:ascii="Symbol" w:hAnsi="Symbol" w:hint="default"/>
+      </w:rPr>
+    </w:lvl>
+    <w:lvl w:ilvl="1" w:tplc="40090003">
+      <w:start w:val="1"/>
+      <w:numFmt w:val="bullet"/>
+      <w:lvlText w:val="o"/>
+      <w:lvlJc w:val="left"/>
+      <w:pPr>
+        <w:ind w:left="1440" w:hanging="360"/>
+      </w:pPr>
+      <w:rPr>
+        <w:rFonts w:ascii="Courier New" w:hAnsi="Courier New" w:cs="Courier New" w:hint="default"/>
+      </w:rPr>
+    </w:lvl>
+    <w:lvl w:ilvl="2" w:tplc="40090005">
+      <w:start w:val="1"/>
+      <w:numFmt w:val="bullet"/>
+      <w:lvlText w:val=""/>
+      <w:lvlJc w:val="left"/>
+      <w:pPr>
+        <w:ind w:left="2160" w:hanging="360"/>
+      </w:pPr>
+      <w:rPr>
+        <w:rFonts w:ascii="Wingdings" w:hAnsi="Wingdings" w:hint="default"/>
+      </w:rPr>
+    </w:lvl>
+    <w:lvl w:ilvl="3" w:tplc="40090001">
+      <w:start w:val="1"/>
+      <w:numFmt w:val="bullet"/>
+      <w:lvlText w:val=""/>
+      <w:lvlJc w:val="left"/>
+      <w:pPr>
+        <w:ind w:left="2880" w:hanging="360"/>
+      </w:pPr>
+      <w:rPr>
+        <w:rFonts w:ascii="Symbol" w:hAnsi="Symbol" w:hint="default"/>
+      </w:rPr>
+    </w:lvl>
+    <w:lvl w:ilvl="4" w:tplc="40090003" w:tentative="1">
+      <w:start w:val="1"/>
+      <w:numFmt w:val="bullet"/>
+      <w:lvlText w:val="o"/>
+      <w:lvlJc w:val="left"/>
+      <w:pPr>
+        <w:ind w:left="3600" w:hanging="360"/>
+      </w:pPr>
+      <w:rPr>
+        <w:rFonts w:ascii="Courier New" w:hAnsi="Courier New" w:cs="Courier New" w:hint="default"/>
+      </w:rPr>
+    </w:lvl>
+    <w:lvl w:ilvl="5" w:tplc="40090005" w:tentative="1">
+      <w:start w:val="1"/>
+      <w:numFmt w:val="bullet"/>
+      <w:lvlText w:val=""/>
+      <w:lvlJc w:val="left"/>
+      <w:pPr>
+        <w:ind w:left="4320" w:hanging="360"/>
+      </w:pPr>
+      <w:rPr>
+        <w:rFonts w:ascii="Wingdings" w:hAnsi="Wingdings" w:hint="default"/>
+      </w:rPr>
+    </w:lvl>
+    <w:lvl w:ilvl="6" w:tplc="40090001" w:tentative="1">
+      <w:start w:val="1"/>
+      <w:numFmt w:val="bullet"/>
+      <w:lvlText w:val=""/>
+      <w:lvlJc w:val="left"/>
+      <w:pPr>
+        <w:ind w:left="5040" w:hanging="360"/>
+      </w:pPr>
+      <w:rPr>
+        <w:rFonts w:ascii="Symbol" w:hAnsi="Symbol" w:hint="default"/>
+      </w:rPr>
+    </w:lvl>
+    <w:lvl w:ilvl="7" w:tplc="40090003" w:tentative="1">
+      <w:start w:val="1"/>
+      <w:numFmt w:val="bullet"/>
+      <w:lvlText w:val="o"/>
+      <w:lvlJc w:val="left"/>
+      <w:pPr>
+        <w:ind w:left="5760" w:hanging="360"/>
+      </w:pPr>
+      <w:rPr>
+        <w:rFonts w:ascii="Courier New" w:hAnsi="Courier New" w:cs="Courier New" w:hint="default"/>
+      </w:rPr>
+    </w:lvl>
+    <w:lvl w:ilvl="8" w:tplc="40090005" w:tentative="1">
+      <w:start w:val="1"/>
+      <w:numFmt w:val="bullet"/>
+      <w:lvlText w:val=""/>
+      <w:lvlJc w:val="left"/>
+      <w:pPr>
+        <w:ind w:left="6480" w:hanging="360"/>
+      </w:pPr>
+      <w:rPr>
+        <w:rFonts w:ascii="Wingdings" w:hAnsi="Wingdings" w:hint="default"/>
+      </w:rPr>
+    </w:lvl>
+  </w:abstractNum>
+  <w:abstractNum w:abstractNumId="13" w15:restartNumberingAfterBreak="0">
+    <w:nsid w:val="5A262B88"/>
+    <w:multiLevelType w:val="hybridMultilevel"/>
+    <w:tmpl w:val="78C82A4E"/>
+    <w:lvl w:ilvl="0" w:tplc="40090001">
+      <w:start w:val="1"/>
+      <w:numFmt w:val="bullet"/>
+      <w:lvlText w:val=""/>
+      <w:lvlJc w:val="left"/>
+      <w:pPr>
+        <w:ind w:left="720" w:hanging="360"/>
+      </w:pPr>
+      <w:rPr>
+        <w:rFonts w:ascii="Symbol" w:hAnsi="Symbol" w:hint="default"/>
+      </w:rPr>
+    </w:lvl>
+    <w:lvl w:ilvl="1" w:tplc="40090003" w:tentative="1">
+      <w:start w:val="1"/>
+      <w:numFmt w:val="bullet"/>
+      <w:lvlText w:val="o"/>
+      <w:lvlJc w:val="left"/>
+      <w:pPr>
+        <w:ind w:left="1440" w:hanging="360"/>
+      </w:pPr>
+      <w:rPr>
+        <w:rFonts w:ascii="Courier New" w:hAnsi="Courier New" w:cs="Courier New" w:hint="default"/>
+      </w:rPr>
+    </w:lvl>
+    <w:lvl w:ilvl="2" w:tplc="40090005" w:tentative="1">
+      <w:start w:val="1"/>
+      <w:numFmt w:val="bullet"/>
+      <w:lvlText w:val=""/>
+      <w:lvlJc w:val="left"/>
+      <w:pPr>
+        <w:ind w:left="2160" w:hanging="360"/>
+      </w:pPr>
+      <w:rPr>
+        <w:rFonts w:ascii="Wingdings" w:hAnsi="Wingdings" w:hint="default"/>
+      </w:rPr>
+    </w:lvl>
+    <w:lvl w:ilvl="3" w:tplc="40090001" w:tentative="1">
+      <w:start w:val="1"/>
+      <w:numFmt w:val="bullet"/>
+      <w:lvlText w:val=""/>
+      <w:lvlJc w:val="left"/>
+      <w:pPr>
+        <w:ind w:left="2880" w:hanging="360"/>
+      </w:pPr>
+      <w:rPr>
+        <w:rFonts w:ascii="Symbol" w:hAnsi="Symbol" w:hint="default"/>
+      </w:rPr>
+    </w:lvl>
+    <w:lvl w:ilvl="4" w:tplc="40090003" w:tentative="1">
+      <w:start w:val="1"/>
+      <w:numFmt w:val="bullet"/>
+      <w:lvlText w:val="o"/>
+      <w:lvlJc w:val="left"/>
+      <w:pPr>
+        <w:ind w:left="3600" w:hanging="360"/>
+      </w:pPr>
+      <w:rPr>
+        <w:rFonts w:ascii="Courier New" w:hAnsi="Courier New" w:cs="Courier New" w:hint="default"/>
+      </w:rPr>
+    </w:lvl>
+    <w:lvl w:ilvl="5" w:tplc="40090005" w:tentative="1">
+      <w:start w:val="1"/>
+      <w:numFmt w:val="bullet"/>
+      <w:lvlText w:val=""/>
+      <w:lvlJc w:val="left"/>
+      <w:pPr>
+        <w:ind w:left="4320" w:hanging="360"/>
+      </w:pPr>
+      <w:rPr>
+        <w:rFonts w:ascii="Wingdings" w:hAnsi="Wingdings" w:hint="default"/>
+      </w:rPr>
+    </w:lvl>
+    <w:lvl w:ilvl="6" w:tplc="40090001" w:tentative="1">
+      <w:start w:val="1"/>
+      <w:numFmt w:val="bullet"/>
+      <w:lvlText w:val=""/>
+      <w:lvlJc w:val="left"/>
+      <w:pPr>
+        <w:ind w:left="5040" w:hanging="360"/>
+      </w:pPr>
+      <w:rPr>
+        <w:rFonts w:ascii="Symbol" w:hAnsi="Symbol" w:hint="default"/>
+      </w:rPr>
+    </w:lvl>
+    <w:lvl w:ilvl="7" w:tplc="40090003" w:tentative="1">
+      <w:start w:val="1"/>
+      <w:numFmt w:val="bullet"/>
+      <w:lvlText w:val="o"/>
+      <w:lvlJc w:val="left"/>
+      <w:pPr>
+        <w:ind w:left="5760" w:hanging="360"/>
+      </w:pPr>
+      <w:rPr>
+        <w:rFonts w:ascii="Courier New" w:hAnsi="Courier New" w:cs="Courier New" w:hint="default"/>
+      </w:rPr>
+    </w:lvl>
+    <w:lvl w:ilvl="8" w:tplc="40090005" w:tentative="1">
+      <w:start w:val="1"/>
+      <w:numFmt w:val="bullet"/>
+      <w:lvlText w:val=""/>
+      <w:lvlJc w:val="left"/>
+      <w:pPr>
+        <w:ind w:left="6480" w:hanging="360"/>
+      </w:pPr>
+      <w:rPr>
+        <w:rFonts w:ascii="Wingdings" w:hAnsi="Wingdings" w:hint="default"/>
+      </w:rPr>
+    </w:lvl>
+  </w:abstractNum>
+  <w:abstractNum w:abstractNumId="14" w15:restartNumberingAfterBreak="0">
+    <w:nsid w:val="6BE02D44"/>
+    <w:multiLevelType w:val="hybridMultilevel"/>
+    <w:tmpl w:val="6D060348"/>
+    <w:lvl w:ilvl="0" w:tplc="40090001">
+      <w:start w:val="1"/>
+      <w:numFmt w:val="bullet"/>
+      <w:lvlText w:val=""/>
+      <w:lvlJc w:val="left"/>
+      <w:pPr>
+        <w:ind w:left="950" w:hanging="360"/>
+      </w:pPr>
+      <w:rPr>
+        <w:rFonts w:ascii="Symbol" w:hAnsi="Symbol" w:hint="default"/>
+      </w:rPr>
+    </w:lvl>
+    <w:lvl w:ilvl="1" w:tplc="40090003" w:tentative="1">
+      <w:start w:val="1"/>
+      <w:numFmt w:val="bullet"/>
+      <w:lvlText w:val="o"/>
+      <w:lvlJc w:val="left"/>
+      <w:pPr>
+        <w:ind w:left="1670" w:hanging="360"/>
+      </w:pPr>
+      <w:rPr>
+        <w:rFonts w:ascii="Courier New" w:hAnsi="Courier New" w:cs="Courier New" w:hint="default"/>
+      </w:rPr>
+    </w:lvl>
+    <w:lvl w:ilvl="2" w:tplc="40090005" w:tentative="1">
+      <w:start w:val="1"/>
+      <w:numFmt w:val="bullet"/>
+      <w:lvlText w:val=""/>
+      <w:lvlJc w:val="left"/>
+      <w:pPr>
+        <w:ind w:left="2390" w:hanging="360"/>
+      </w:pPr>
+      <w:rPr>
+        <w:rFonts w:ascii="Wingdings" w:hAnsi="Wingdings" w:hint="default"/>
+      </w:rPr>
+    </w:lvl>
+    <w:lvl w:ilvl="3" w:tplc="40090001" w:tentative="1">
+      <w:start w:val="1"/>
+      <w:numFmt w:val="bullet"/>
+      <w:lvlText w:val=""/>
+      <w:lvlJc w:val="left"/>
+      <w:pPr>
+        <w:ind w:left="3110" w:hanging="360"/>
+      </w:pPr>
+      <w:rPr>
+        <w:rFonts w:ascii="Symbol" w:hAnsi="Symbol" w:hint="default"/>
+      </w:rPr>
+    </w:lvl>
+    <w:lvl w:ilvl="4" w:tplc="40090003" w:tentative="1">
+      <w:start w:val="1"/>
+      <w:numFmt w:val="bullet"/>
+      <w:lvlText w:val="o"/>
+      <w:lvlJc w:val="left"/>
+      <w:pPr>
+        <w:ind w:left="3830" w:hanging="360"/>
+      </w:pPr>
+      <w:rPr>
+        <w:rFonts w:ascii="Courier New" w:hAnsi="Courier New" w:cs="Courier New" w:hint="default"/>
+      </w:rPr>
+    </w:lvl>
+    <w:lvl w:ilvl="5" w:tplc="40090005" w:tentative="1">
+      <w:start w:val="1"/>
+      <w:numFmt w:val="bullet"/>
+      <w:lvlText w:val=""/>
+      <w:lvlJc w:val="left"/>
+      <w:pPr>
+        <w:ind w:left="4550" w:hanging="360"/>
+      </w:pPr>
+      <w:rPr>
+        <w:rFonts w:ascii="Wingdings" w:hAnsi="Wingdings" w:hint="default"/>
+      </w:rPr>
+    </w:lvl>
+    <w:lvl w:ilvl="6" w:tplc="40090001" w:tentative="1">
+      <w:start w:val="1"/>
+      <w:numFmt w:val="bullet"/>
+      <w:lvlText w:val=""/>
+      <w:lvlJc w:val="left"/>
+      <w:pPr>
+        <w:ind w:left="5270" w:hanging="360"/>
+      </w:pPr>
+      <w:rPr>
+        <w:rFonts w:ascii="Symbol" w:hAnsi="Symbol" w:hint="default"/>
+      </w:rPr>
+    </w:lvl>
+    <w:lvl w:ilvl="7" w:tplc="40090003" w:tentative="1">
+      <w:start w:val="1"/>
+      <w:numFmt w:val="bullet"/>
+      <w:lvlText w:val="o"/>
+      <w:lvlJc w:val="left"/>
+      <w:pPr>
+        <w:ind w:left="5990" w:hanging="360"/>
+      </w:pPr>
+      <w:rPr>
+        <w:rFonts w:ascii="Courier New" w:hAnsi="Courier New" w:cs="Courier New" w:hint="default"/>
+      </w:rPr>
+    </w:lvl>
+    <w:lvl w:ilvl="8" w:tplc="40090005" w:tentative="1">
+      <w:start w:val="1"/>
+      <w:numFmt w:val="bullet"/>
+      <w:lvlText w:val=""/>
+      <w:lvlJc w:val="left"/>
+      <w:pPr>
+        <w:ind w:left="6710" w:hanging="360"/>
+      </w:pPr>
+      <w:rPr>
+        <w:rFonts w:ascii="Wingdings" w:hAnsi="Wingdings" w:hint="default"/>
+      </w:rPr>
+    </w:lvl>
+  </w:abstractNum>
+  <w:abstractNum w:abstractNumId="15" w15:restartNumberingAfterBreak="0">
+    <w:nsid w:val="6E2023AC"/>
+    <w:multiLevelType w:val="hybridMultilevel"/>
+    <w:tmpl w:val="55B805E4"/>
+    <w:lvl w:ilvl="0" w:tplc="40090001">
+      <w:start w:val="1"/>
+      <w:numFmt w:val="bullet"/>
+      <w:lvlText w:val=""/>
+      <w:lvlJc w:val="left"/>
+      <w:pPr>
+        <w:ind w:left="950" w:hanging="360"/>
+      </w:pPr>
+      <w:rPr>
+        <w:rFonts w:ascii="Symbol" w:hAnsi="Symbol" w:hint="default"/>
+      </w:rPr>
+    </w:lvl>
+    <w:lvl w:ilvl="1" w:tplc="40090003" w:tentative="1">
+      <w:start w:val="1"/>
+      <w:numFmt w:val="bullet"/>
+      <w:lvlText w:val="o"/>
+      <w:lvlJc w:val="left"/>
+      <w:pPr>
+        <w:ind w:left="1670" w:hanging="360"/>
+      </w:pPr>
+      <w:rPr>
+        <w:rFonts w:ascii="Courier New" w:hAnsi="Courier New" w:cs="Courier New" w:hint="default"/>
+      </w:rPr>
+    </w:lvl>
+    <w:lvl w:ilvl="2" w:tplc="40090005" w:tentative="1">
+      <w:start w:val="1"/>
+      <w:numFmt w:val="bullet"/>
+      <w:lvlText w:val=""/>
+      <w:lvlJc w:val="left"/>
+      <w:pPr>
+        <w:ind w:left="2390" w:hanging="360"/>
+      </w:pPr>
+      <w:rPr>
+        <w:rFonts w:ascii="Wingdings" w:hAnsi="Wingdings" w:hint="default"/>
+      </w:rPr>
+    </w:lvl>
+    <w:lvl w:ilvl="3" w:tplc="40090001" w:tentative="1">
+      <w:start w:val="1"/>
+      <w:numFmt w:val="bullet"/>
+      <w:lvlText w:val=""/>
+      <w:lvlJc w:val="left"/>
+      <w:pPr>
+        <w:ind w:left="3110" w:hanging="360"/>
+      </w:pPr>
+      <w:rPr>
+        <w:rFonts w:ascii="Symbol" w:hAnsi="Symbol" w:hint="default"/>
+      </w:rPr>
+    </w:lvl>
+    <w:lvl w:ilvl="4" w:tplc="40090003" w:tentative="1">
+      <w:start w:val="1"/>
+      <w:numFmt w:val="bullet"/>
+      <w:lvlText w:val="o"/>
+      <w:lvlJc w:val="left"/>
+      <w:pPr>
+        <w:ind w:left="3830" w:hanging="360"/>
+      </w:pPr>
+      <w:rPr>
+        <w:rFonts w:ascii="Courier New" w:hAnsi="Courier New" w:cs="Courier New" w:hint="default"/>
+      </w:rPr>
+    </w:lvl>
+    <w:lvl w:ilvl="5" w:tplc="40090005" w:tentative="1">
+      <w:start w:val="1"/>
+      <w:numFmt w:val="bullet"/>
+      <w:lvlText w:val=""/>
+      <w:lvlJc w:val="left"/>
+      <w:pPr>
+        <w:ind w:left="4550" w:hanging="360"/>
+      </w:pPr>
+      <w:rPr>
+        <w:rFonts w:ascii="Wingdings" w:hAnsi="Wingdings" w:hint="default"/>
+      </w:rPr>
+    </w:lvl>
+    <w:lvl w:ilvl="6" w:tplc="40090001" w:tentative="1">
+      <w:start w:val="1"/>
+      <w:numFmt w:val="bullet"/>
+      <w:lvlText w:val=""/>
+      <w:lvlJc w:val="left"/>
+      <w:pPr>
+        <w:ind w:left="5270" w:hanging="360"/>
+      </w:pPr>
+      <w:rPr>
+        <w:rFonts w:ascii="Symbol" w:hAnsi="Symbol" w:hint="default"/>
+      </w:rPr>
+    </w:lvl>
+    <w:lvl w:ilvl="7" w:tplc="40090003" w:tentative="1">
+      <w:start w:val="1"/>
+      <w:numFmt w:val="bullet"/>
+      <w:lvlText w:val="o"/>
+      <w:lvlJc w:val="left"/>
+      <w:pPr>
+        <w:ind w:left="5990" w:hanging="360"/>
+      </w:pPr>
+      <w:rPr>
+        <w:rFonts w:ascii="Courier New" w:hAnsi="Courier New" w:cs="Courier New" w:hint="default"/>
+      </w:rPr>
+    </w:lvl>
+    <w:lvl w:ilvl="8" w:tplc="40090005" w:tentative="1">
+      <w:start w:val="1"/>
+      <w:numFmt w:val="bullet"/>
+      <w:lvlText w:val=""/>
+      <w:lvlJc w:val="left"/>
+      <w:pPr>
+        <w:ind w:left="6710" w:hanging="360"/>
+      </w:pPr>
+      <w:rPr>
+        <w:rFonts w:ascii="Wingdings" w:hAnsi="Wingdings" w:hint="default"/>
+      </w:rPr>
+    </w:lvl>
+  </w:abstractNum>
+  <w:abstractNum w:abstractNumId="16" w15:restartNumberingAfterBreak="0">
+    <w:nsid w:val="7278373D"/>
+    <w:multiLevelType w:val="hybridMultilevel"/>
+    <w:tmpl w:val="C54433F2"/>
+    <w:lvl w:ilvl="0" w:tplc="40090001">
+      <w:start w:val="1"/>
+      <w:numFmt w:val="bullet"/>
+      <w:lvlText w:val=""/>
+      <w:lvlJc w:val="left"/>
+      <w:pPr>
+        <w:ind w:left="720" w:hanging="360"/>
+      </w:pPr>
+      <w:rPr>
+        <w:rFonts w:ascii="Symbol" w:hAnsi="Symbol" w:hint="default"/>
+      </w:rPr>
+    </w:lvl>
+    <w:lvl w:ilvl="1" w:tplc="40090003" w:tentative="1">
+      <w:start w:val="1"/>
+      <w:numFmt w:val="bullet"/>
+      <w:lvlText w:val="o"/>
+      <w:lvlJc w:val="left"/>
+      <w:pPr>
+        <w:ind w:left="1440" w:hanging="360"/>
+      </w:pPr>
+      <w:rPr>
+        <w:rFonts w:ascii="Courier New" w:hAnsi="Courier New" w:cs="Courier New" w:hint="default"/>
+      </w:rPr>
+    </w:lvl>
+    <w:lvl w:ilvl="2" w:tplc="40090005" w:tentative="1">
+      <w:start w:val="1"/>
+      <w:numFmt w:val="bullet"/>
+      <w:lvlText w:val=""/>
+      <w:lvlJc w:val="left"/>
+      <w:pPr>
+        <w:ind w:left="2160" w:hanging="360"/>
+      </w:pPr>
+      <w:rPr>
+        <w:rFonts w:ascii="Wingdings" w:hAnsi="Wingdings" w:hint="default"/>
+      </w:rPr>
+    </w:lvl>
+    <w:lvl w:ilvl="3" w:tplc="40090001" w:tentative="1">
+      <w:start w:val="1"/>
+      <w:numFmt w:val="bullet"/>
+      <w:lvlText w:val=""/>
+      <w:lvlJc w:val="left"/>
+      <w:pPr>
+        <w:ind w:left="2880" w:hanging="360"/>
+      </w:pPr>
+      <w:rPr>
+        <w:rFonts w:ascii="Symbol" w:hAnsi="Symbol" w:hint="default"/>
+      </w:rPr>
+    </w:lvl>
+    <w:lvl w:ilvl="4" w:tplc="40090003" w:tentative="1">
+      <w:start w:val="1"/>
+      <w:numFmt w:val="bullet"/>
+      <w:lvlText w:val="o"/>
+      <w:lvlJc w:val="left"/>
+      <w:pPr>
+        <w:ind w:left="3600" w:hanging="360"/>
+      </w:pPr>
+      <w:rPr>
+        <w:rFonts w:ascii="Courier New" w:hAnsi="Courier New" w:cs="Courier New" w:hint="default"/>
+      </w:rPr>
+    </w:lvl>
+    <w:lvl w:ilvl="5" w:tplc="40090005" w:tentative="1">
+      <w:start w:val="1"/>
+      <w:numFmt w:val="bullet"/>
+      <w:lvlText w:val=""/>
+      <w:lvlJc w:val="left"/>
+      <w:pPr>
+        <w:ind w:left="4320" w:hanging="360"/>
+      </w:pPr>
+      <w:rPr>
+        <w:rFonts w:ascii="Wingdings" w:hAnsi="Wingdings" w:hint="default"/>
+      </w:rPr>
+    </w:lvl>
+    <w:lvl w:ilvl="6" w:tplc="40090001" w:tentative="1">
+      <w:start w:val="1"/>
+      <w:numFmt w:val="bullet"/>
+      <w:lvlText w:val=""/>
+      <w:lvlJc w:val="left"/>
+      <w:pPr>
+        <w:ind w:left="5040" w:hanging="360"/>
+      </w:pPr>
+      <w:rPr>
+        <w:rFonts w:ascii="Symbol" w:hAnsi="Symbol" w:hint="default"/>
+      </w:rPr>
+    </w:lvl>
+    <w:lvl w:ilvl="7" w:tplc="40090003" w:tentative="1">
+      <w:start w:val="1"/>
+      <w:numFmt w:val="bullet"/>
+      <w:lvlText w:val="o"/>
+      <w:lvlJc w:val="left"/>
+      <w:pPr>
+        <w:ind w:left="5760" w:hanging="360"/>
+      </w:pPr>
+      <w:rPr>
+        <w:rFonts w:ascii="Courier New" w:hAnsi="Courier New" w:cs="Courier New" w:hint="default"/>
+      </w:rPr>
+    </w:lvl>
+    <w:lvl w:ilvl="8" w:tplc="40090005" w:tentative="1">
+      <w:start w:val="1"/>
+      <w:numFmt w:val="bullet"/>
+      <w:lvlText w:val=""/>
+      <w:lvlJc w:val="left"/>
+      <w:pPr>
+        <w:ind w:left="6480" w:hanging="360"/>
+      </w:pPr>
+      <w:rPr>
+        <w:rFonts w:ascii="Wingdings" w:hAnsi="Wingdings" w:hint="default"/>
+      </w:rPr>
+    </w:lvl>
+  </w:abstractNum>
+  <w:abstractNum w:abstractNumId="17" w15:restartNumberingAfterBreak="0">
+    <w:nsid w:val="7D4B0CA5"/>
+    <w:multiLevelType w:val="hybridMultilevel"/>
+    <w:tmpl w:val="A39C13D4"/>
+    <w:lvl w:ilvl="0" w:tplc="40090001">
+      <w:start w:val="1"/>
+      <w:numFmt w:val="bullet"/>
+      <w:lvlText w:val=""/>
+      <w:lvlJc w:val="left"/>
+      <w:pPr>
+        <w:ind w:left="720" w:hanging="360"/>
+      </w:pPr>
+      <w:rPr>
+        <w:rFonts w:ascii="Symbol" w:hAnsi="Symbol" w:hint="default"/>
+      </w:rPr>
+    </w:lvl>
+    <w:lvl w:ilvl="1" w:tplc="40090003" w:tentative="1">
+      <w:start w:val="1"/>
+      <w:numFmt w:val="bullet"/>
+      <w:lvlText w:val="o"/>
+      <w:lvlJc w:val="left"/>
+      <w:pPr>
+        <w:ind w:left="1440" w:hanging="360"/>
+      </w:pPr>
+      <w:rPr>
+        <w:rFonts w:ascii="Courier New" w:hAnsi="Courier New" w:cs="Courier New" w:hint="default"/>
+      </w:rPr>
+    </w:lvl>
+    <w:lvl w:ilvl="2" w:tplc="40090005" w:tentative="1">
+      <w:start w:val="1"/>
+      <w:numFmt w:val="bullet"/>
+      <w:lvlText w:val=""/>
+      <w:lvlJc w:val="left"/>
+      <w:pPr>
+        <w:ind w:left="2160" w:hanging="360"/>
+      </w:pPr>
+      <w:rPr>
+        <w:rFonts w:ascii="Wingdings" w:hAnsi="Wingdings" w:hint="default"/>
+      </w:rPr>
+    </w:lvl>
+    <w:lvl w:ilvl="3" w:tplc="40090001" w:tentative="1">
+      <w:start w:val="1"/>
+      <w:numFmt w:val="bullet"/>
+      <w:lvlText w:val=""/>
+      <w:lvlJc w:val="left"/>
+      <w:pPr>
+        <w:ind w:left="2880" w:hanging="360"/>
+      </w:pPr>
+      <w:rPr>
+        <w:rFonts w:ascii="Symbol" w:hAnsi="Symbol" w:hint="default"/>
+      </w:rPr>
+    </w:lvl>
+    <w:lvl w:ilvl="4" w:tplc="40090003" w:tentative="1">
+      <w:start w:val="1"/>
+      <w:numFmt w:val="bullet"/>
+      <w:lvlText w:val="o"/>
+      <w:lvlJc w:val="left"/>
+      <w:pPr>
+        <w:ind w:left="3600" w:hanging="360"/>
+      </w:pPr>
+      <w:rPr>
+        <w:rFonts w:ascii="Courier New" w:hAnsi="Courier New" w:cs="Courier New" w:hint="default"/>
+      </w:rPr>
+    </w:lvl>
+    <w:lvl w:ilvl="5" w:tplc="40090005" w:tentative="1">
+      <w:start w:val="1"/>
+      <w:numFmt w:val="bullet"/>
+      <w:lvlText w:val=""/>
+      <w:lvlJc w:val="left"/>
+      <w:pPr>
+        <w:ind w:left="4320" w:hanging="360"/>
+      </w:pPr>
+      <w:rPr>
+        <w:rFonts w:ascii="Wingdings" w:hAnsi="Wingdings" w:hint="default"/>
+      </w:rPr>
+    </w:lvl>
+    <w:lvl w:ilvl="6" w:tplc="40090001" w:tentative="1">
+      <w:start w:val="1"/>
+      <w:numFmt w:val="bullet"/>
+      <w:lvlText w:val=""/>
+      <w:lvlJc w:val="left"/>
+      <w:pPr>
+        <w:ind w:left="5040" w:hanging="360"/>
+      </w:pPr>
+      <w:rPr>
+        <w:rFonts w:ascii="Symbol" w:hAnsi="Symbol" w:hint="default"/>
+      </w:rPr>
+    </w:lvl>
+    <w:lvl w:ilvl="7" w:tplc="40090003" w:tentative="1">
+      <w:start w:val="1"/>
+      <w:numFmt w:val="bullet"/>
+      <w:lvlText w:val="o"/>
+      <w:lvlJc w:val="left"/>
+      <w:pPr>
+        <w:ind w:left="5760" w:hanging="360"/>
+      </w:pPr>
+      <w:rPr>
+        <w:rFonts w:ascii="Courier New" w:hAnsi="Courier New" w:cs="Courier New" w:hint="default"/>
+      </w:rPr>
+    </w:lvl>
+    <w:lvl w:ilvl="8" w:tplc="40090005" w:tentative="1">
+      <w:start w:val="1"/>
+      <w:numFmt w:val="bullet"/>
+      <w:lvlText w:val=""/>
+      <w:lvlJc w:val="left"/>
+      <w:pPr>
+        <w:ind w:left="6480" w:hanging="360"/>
+      </w:pPr>
+      <w:rPr>
+        <w:rFonts w:ascii="Wingdings" w:hAnsi="Wingdings" w:hint="default"/>
       </w:rPr>
     </w:lvl>
   </w:abstractNum>
@@ -3211,6 +4351,33 @@
   </w:num>
   <w:num w:numId="9" w16cid:durableId="2060207996">
     <w:abstractNumId w:val="0"/>
+  </w:num>
+  <w:num w:numId="10" w16cid:durableId="1663043515">
+    <w:abstractNumId w:val="11"/>
+  </w:num>
+  <w:num w:numId="11" w16cid:durableId="952590061">
+    <w:abstractNumId w:val="15"/>
+  </w:num>
+  <w:num w:numId="12" w16cid:durableId="59061777">
+    <w:abstractNumId w:val="16"/>
+  </w:num>
+  <w:num w:numId="13" w16cid:durableId="1168331100">
+    <w:abstractNumId w:val="14"/>
+  </w:num>
+  <w:num w:numId="14" w16cid:durableId="1558854852">
+    <w:abstractNumId w:val="13"/>
+  </w:num>
+  <w:num w:numId="15" w16cid:durableId="483350800">
+    <w:abstractNumId w:val="9"/>
+  </w:num>
+  <w:num w:numId="16" w16cid:durableId="232854800">
+    <w:abstractNumId w:val="10"/>
+  </w:num>
+  <w:num w:numId="17" w16cid:durableId="471367224">
+    <w:abstractNumId w:val="17"/>
+  </w:num>
+  <w:num w:numId="18" w16cid:durableId="2102217007">
+    <w:abstractNumId w:val="12"/>
   </w:num>
 </w:numbering>
 </file>
@@ -3823,7 +4990,6 @@
   <w:style w:type="character" w:default="1" w:styleId="DefaultParagraphFont">
     <w:name w:val="Default Paragraph Font"/>
     <w:uiPriority w:val="1"/>
-    <w:semiHidden/>
     <w:unhideWhenUsed/>
   </w:style>
   <w:style w:type="table" w:default="1" w:styleId="TableNormal">

</xml_diff>